<commit_message>
updated Secure Settings Document secondary document (cleaned up images / text)
</commit_message>
<xml_diff>
--- a/source/reference_documents/secondary_documents/implementation phase/Secure Settings Document/Secure Settings Document.docx
+++ b/source/reference_documents/secondary_documents/implementation phase/Secure Settings Document/Secure Settings Document.docx
@@ -1,6 +1,6 @@
 
 <file path=word/document.xml><?xml version="1.0" encoding="utf-8"?>
-<w:document xmlns:wpc="http://schemas.microsoft.com/office/word/2010/wordprocessingCanvas" xmlns:cx="http://schemas.microsoft.com/office/drawing/2014/chartex" xmlns:cx1="http://schemas.microsoft.com/office/drawing/2015/9/8/chartex" xmlns:cx2="http://schemas.microsoft.com/office/drawing/2015/10/21/chartex" xmlns:cx3="http://schemas.microsoft.com/office/drawing/2016/5/9/chartex" xmlns:cx4="http://schemas.microsoft.com/office/drawing/2016/5/10/chartex" xmlns:cx5="http://schemas.microsoft.com/office/drawing/2016/5/11/chartex" xmlns:cx6="http://schemas.microsoft.com/office/drawing/2016/5/12/chartex" xmlns:cx7="http://schemas.microsoft.com/office/drawing/2016/5/13/chartex" xmlns:cx8="http://schemas.microsoft.com/office/drawing/2016/5/14/chartex" xmlns:mc="http://schemas.openxmlformats.org/markup-compatibility/2006" xmlns:aink="http://schemas.microsoft.com/office/drawing/2016/ink" xmlns:am3d="http://schemas.microsoft.com/office/drawing/2017/model3d" xmlns:o="urn:schemas-microsoft-com:office:office" xmlns:oel="http://schemas.microsoft.com/office/2019/extlst" xmlns:r="http://schemas.openxmlformats.org/officeDocument/2006/relationships" xmlns:m="http://schemas.openxmlformats.org/officeDocument/2006/math" xmlns:v="urn:schemas-microsoft-com:vml" xmlns:wp14="http://schemas.microsoft.com/office/word/2010/wordprocessingDrawing" xmlns:wp="http://schemas.openxmlformats.org/drawingml/2006/wordprocessingDrawing" xmlns:w10="urn:schemas-microsoft-com:office:word" xmlns:w="http://schemas.openxmlformats.org/wordprocessingml/2006/main" xmlns:w14="http://schemas.microsoft.com/office/word/2010/wordml" xmlns:w15="http://schemas.microsoft.com/office/word/2012/wordml" xmlns:w16cex="http://schemas.microsoft.com/office/word/2018/wordml/cex" xmlns:w16cid="http://schemas.microsoft.com/office/word/2016/wordml/cid" xmlns:w16="http://schemas.microsoft.com/office/word/2018/wordml" xmlns:w16sdtdh="http://schemas.microsoft.com/office/word/2020/wordml/sdtdatahash" xmlns:w16se="http://schemas.microsoft.com/office/word/2015/wordml/symex" xmlns:wpg="http://schemas.microsoft.com/office/word/2010/wordprocessingGroup" xmlns:wpi="http://schemas.microsoft.com/office/word/2010/wordprocessingInk" xmlns:wne="http://schemas.microsoft.com/office/word/2006/wordml" xmlns:wps="http://schemas.microsoft.com/office/word/2010/wordprocessingShape" mc:Ignorable="w14 w15 w16se w16cid w16 w16cex w16sdtdh wp14">
+<w:document xmlns:wpc="http://schemas.microsoft.com/office/word/2010/wordprocessingCanvas" xmlns:cx="http://schemas.microsoft.com/office/drawing/2014/chartex" xmlns:cx1="http://schemas.microsoft.com/office/drawing/2015/9/8/chartex" xmlns:cx2="http://schemas.microsoft.com/office/drawing/2015/10/21/chartex" xmlns:cx3="http://schemas.microsoft.com/office/drawing/2016/5/9/chartex" xmlns:cx4="http://schemas.microsoft.com/office/drawing/2016/5/10/chartex" xmlns:cx5="http://schemas.microsoft.com/office/drawing/2016/5/11/chartex" xmlns:cx6="http://schemas.microsoft.com/office/drawing/2016/5/12/chartex" xmlns:cx7="http://schemas.microsoft.com/office/drawing/2016/5/13/chartex" xmlns:cx8="http://schemas.microsoft.com/office/drawing/2016/5/14/chartex" xmlns:mc="http://schemas.openxmlformats.org/markup-compatibility/2006" xmlns:aink="http://schemas.microsoft.com/office/drawing/2016/ink" xmlns:am3d="http://schemas.microsoft.com/office/drawing/2017/model3d" xmlns:o="urn:schemas-microsoft-com:office:office" xmlns:oel="http://schemas.microsoft.com/office/2019/extlst" xmlns:r="http://schemas.openxmlformats.org/officeDocument/2006/relationships" xmlns:m="http://schemas.openxmlformats.org/officeDocument/2006/math" xmlns:v="urn:schemas-microsoft-com:vml" xmlns:wp14="http://schemas.microsoft.com/office/word/2010/wordprocessingDrawing" xmlns:wp="http://schemas.openxmlformats.org/drawingml/2006/wordprocessingDrawing" xmlns:w10="urn:schemas-microsoft-com:office:word" xmlns:w="http://schemas.openxmlformats.org/wordprocessingml/2006/main" xmlns:w14="http://schemas.microsoft.com/office/word/2010/wordml" xmlns:w15="http://schemas.microsoft.com/office/word/2012/wordml" xmlns:w16cex="http://schemas.microsoft.com/office/word/2018/wordml/cex" xmlns:w16cid="http://schemas.microsoft.com/office/word/2016/wordml/cid" xmlns:w16="http://schemas.microsoft.com/office/word/2018/wordml" xmlns:w16du="http://schemas.microsoft.com/office/word/2023/wordml/word16du" xmlns:w16sdtdh="http://schemas.microsoft.com/office/word/2020/wordml/sdtdatahash" xmlns:w16sdtfl="http://schemas.microsoft.com/office/word/2024/wordml/sdtformatlock" xmlns:w16se="http://schemas.microsoft.com/office/word/2015/wordml/symex" xmlns:wpg="http://schemas.microsoft.com/office/word/2010/wordprocessingGroup" xmlns:wpi="http://schemas.microsoft.com/office/word/2010/wordprocessingInk" xmlns:wne="http://schemas.microsoft.com/office/word/2006/wordml" xmlns:wps="http://schemas.microsoft.com/office/word/2010/wordprocessingShape" mc:Ignorable="w14 w15 w16se w16cid w16 w16cex w16sdtdh w16sdtfl w16du wp14">
   <w:body>
     <w:p>
       <w:pPr>
@@ -28,7 +28,7 @@
         <w:t xml:space="preserve">Version </w:t>
       </w:r>
       <w:r>
-        <w:t>4</w:t>
+        <w:t>5</w:t>
       </w:r>
     </w:p>
     <w:p>
@@ -45,7 +45,7 @@
         <w:rPr>
           <w:noProof/>
         </w:rPr>
-        <w:t>9/8/23 12:12 PM</w:t>
+        <w:t>8/5/25 9:36 AM</w:t>
       </w:r>
       <w:r>
         <w:fldChar w:fldCharType="end"/>
@@ -69,6 +69,14 @@
     </w:p>
     <w:p>
       <w:pPr>
+        <w:jc w:val="both"/>
+      </w:pPr>
+      <w:r>
+        <w:t>Charles Wilson</w:t>
+      </w:r>
+    </w:p>
+    <w:p>
+      <w:pPr>
         <w:pStyle w:val="Heading1"/>
       </w:pPr>
       <w:r>
@@ -89,7 +97,13 @@
         <w:t xml:space="preserve"> to </w:t>
       </w:r>
       <w:r>
-        <w:t>identify, select and apply security settings to tools used to build the product software</w:t>
+        <w:t xml:space="preserve">identify, select and apply </w:t>
+      </w:r>
+      <w:r>
+        <w:t>cyber</w:t>
+      </w:r>
+      <w:r>
+        <w:t>security settings to tools used to build the product software</w:t>
       </w:r>
       <w:r>
         <w:t>.</w:t>
@@ -139,7 +153,19 @@
         <w:t xml:space="preserve">This document is motivated by the need to </w:t>
       </w:r>
       <w:r>
-        <w:t>ensure that the software is built with tools whose security settings are based on security best practices</w:t>
+        <w:t xml:space="preserve">ensure that the software is built with tools whose </w:t>
+      </w:r>
+      <w:r>
+        <w:t>cyber</w:t>
+      </w:r>
+      <w:r>
+        <w:t xml:space="preserve">security settings are based on </w:t>
+      </w:r>
+      <w:r>
+        <w:t>cyber</w:t>
+      </w:r>
+      <w:r>
+        <w:t>security best practices</w:t>
       </w:r>
       <w:r>
         <w:t xml:space="preserve">. This is necessary given the nature of safety-critical, cyber-physical systems, subject to certifications such as </w:t>
@@ -211,7 +237,19 @@
         <w:rPr>
           <w:lang w:val="en-US"/>
         </w:rPr>
-        <w:t xml:space="preserve">was created by </w:t>
+        <w:t xml:space="preserve">was </w:t>
+      </w:r>
+      <w:r>
+        <w:rPr>
+          <w:lang w:val="en-US"/>
+        </w:rPr>
+        <w:t xml:space="preserve">originally </w:t>
+      </w:r>
+      <w:r>
+        <w:rPr>
+          <w:lang w:val="en-US"/>
+        </w:rPr>
+        <w:t xml:space="preserve">created by </w:t>
       </w:r>
       <w:r>
         <w:rPr>
@@ -255,14 +293,14 @@
       <w:pPr>
         <w:pStyle w:val="FirstParagraph"/>
         <w:jc w:val="both"/>
+        <w:rPr>
+          <w:rStyle w:val="Hyperlink"/>
+        </w:rPr>
       </w:pPr>
       <w:hyperlink r:id="rId7" w:history="1">
         <w:r>
           <w:rPr>
             <w:rStyle w:val="Hyperlink"/>
-            <w:rFonts w:ascii="Courier New" w:hAnsi="Courier New" w:cs="Courier New"/>
-            <w:b/>
-            <w:bCs/>
           </w:rPr>
           <w:t>https://creativecommons.org/licenses/by/4.0/legalcode</w:t>
         </w:r>
@@ -294,7 +332,13 @@
         <w:jc w:val="both"/>
       </w:pPr>
       <w:r>
-        <w:t xml:space="preserve">The most secure application can be compromised because of poorly chosen tool settings. Such configuration errors may be in access control, database management, cryptographic material handling, or communication tools. Security settings must be chosen to ensure the </w:t>
+        <w:t xml:space="preserve">The most secure application can be compromised because of poorly chosen tool settings. Such configuration errors may be in access control, database management, cryptographic material handling, or communication tools. </w:t>
+      </w:r>
+      <w:r>
+        <w:t>Cybers</w:t>
+      </w:r>
+      <w:r>
+        <w:t xml:space="preserve">ecurity settings must be chosen to ensure the </w:t>
       </w:r>
       <w:r>
         <w:t>appropriate</w:t>
@@ -338,10 +382,10 @@
           <w:noProof/>
         </w:rPr>
         <w:drawing>
-          <wp:inline distT="0" distB="0" distL="0" distR="0" wp14:anchorId="0D60A2C1" wp14:editId="2B344BE9">
-            <wp:extent cx="5943600" cy="1927860"/>
-            <wp:effectExtent l="0" t="0" r="0" b="2540"/>
-            <wp:docPr id="1" name="Picture 1" descr="Diagram&#10;&#10;Description automatically generated"/>
+          <wp:inline distT="0" distB="0" distL="0" distR="0" wp14:anchorId="0D60A2C1" wp14:editId="04836AD1">
+            <wp:extent cx="5943600" cy="1925498"/>
+            <wp:effectExtent l="0" t="0" r="0" b="5080"/>
+            <wp:docPr id="1" name="Picture 1"/>
             <wp:cNvGraphicFramePr>
               <a:graphicFrameLocks xmlns:a="http://schemas.openxmlformats.org/drawingml/2006/main" noChangeAspect="1"/>
             </wp:cNvGraphicFramePr>
@@ -349,7 +393,7 @@
               <a:graphicData uri="http://schemas.openxmlformats.org/drawingml/2006/picture">
                 <pic:pic xmlns:pic="http://schemas.openxmlformats.org/drawingml/2006/picture">
                   <pic:nvPicPr>
-                    <pic:cNvPr id="1" name="Picture 1" descr="Diagram&#10;&#10;Description automatically generated"/>
+                    <pic:cNvPr id="1" name="Picture 1"/>
                     <pic:cNvPicPr/>
                   </pic:nvPicPr>
                   <pic:blipFill>
@@ -367,7 +411,7 @@
                   <pic:spPr>
                     <a:xfrm>
                       <a:off x="0" y="0"/>
-                      <a:ext cx="5943600" cy="1927860"/>
+                      <a:ext cx="5943600" cy="1925498"/>
                     </a:xfrm>
                     <a:prstGeom prst="rect">
                       <a:avLst/>
@@ -639,9 +683,9 @@
           <w:noProof/>
         </w:rPr>
         <w:drawing>
-          <wp:inline distT="0" distB="0" distL="0" distR="0" wp14:anchorId="11F802ED" wp14:editId="7AB327E1">
-            <wp:extent cx="3722274" cy="4387273"/>
-            <wp:effectExtent l="0" t="0" r="0" b="0"/>
+          <wp:inline distT="0" distB="0" distL="0" distR="0" wp14:anchorId="11F802ED" wp14:editId="6B21A352">
+            <wp:extent cx="3732692" cy="4401105"/>
+            <wp:effectExtent l="0" t="0" r="1270" b="6350"/>
             <wp:docPr id="2" name="Picture 2"/>
             <wp:cNvGraphicFramePr>
               <a:graphicFrameLocks xmlns:a="http://schemas.openxmlformats.org/drawingml/2006/main" noChangeAspect="1"/>
@@ -654,7 +698,7 @@
                     <pic:cNvPicPr/>
                   </pic:nvPicPr>
                   <pic:blipFill>
-                    <a:blip r:embed="rId9">
+                    <a:blip r:embed="rId9" cstate="print">
                       <a:extLst>
                         <a:ext uri="{28A0092B-C50C-407E-A947-70E740481C1C}">
                           <a14:useLocalDpi xmlns:a14="http://schemas.microsoft.com/office/drawing/2010/main" val="0"/>
@@ -668,7 +712,7 @@
                   <pic:spPr>
                     <a:xfrm>
                       <a:off x="0" y="0"/>
-                      <a:ext cx="3734010" cy="4401105"/>
+                      <a:ext cx="3732692" cy="4401105"/>
                     </a:xfrm>
                     <a:prstGeom prst="rect">
                       <a:avLst/>
@@ -720,7 +764,13 @@
         <w:t>ies</w:t>
       </w:r>
       <w:r>
-        <w:t xml:space="preserve"> the security options. A </w:t>
+        <w:t xml:space="preserve"> the </w:t>
+      </w:r>
+      <w:r>
+        <w:t>cyber</w:t>
+      </w:r>
+      <w:r>
+        <w:t xml:space="preserve">security options. A </w:t>
       </w:r>
       <w:r>
         <w:rPr>
@@ -1054,9 +1104,9 @@
           <w:noProof/>
         </w:rPr>
         <w:drawing>
-          <wp:inline distT="0" distB="0" distL="0" distR="0" wp14:anchorId="08EDF11A" wp14:editId="1B5D1630">
-            <wp:extent cx="3507840" cy="4389120"/>
-            <wp:effectExtent l="0" t="0" r="0" b="5080"/>
+          <wp:inline distT="0" distB="0" distL="0" distR="0" wp14:anchorId="08EDF11A" wp14:editId="302DE11B">
+            <wp:extent cx="3512188" cy="4385909"/>
+            <wp:effectExtent l="0" t="0" r="5715" b="0"/>
             <wp:docPr id="3" name="Picture 3"/>
             <wp:cNvGraphicFramePr>
               <a:graphicFrameLocks xmlns:a="http://schemas.openxmlformats.org/drawingml/2006/main" noChangeAspect="1"/>
@@ -1069,7 +1119,7 @@
                     <pic:cNvPicPr/>
                   </pic:nvPicPr>
                   <pic:blipFill>
-                    <a:blip r:embed="rId10">
+                    <a:blip r:embed="rId10" cstate="print">
                       <a:extLst>
                         <a:ext uri="{28A0092B-C50C-407E-A947-70E740481C1C}">
                           <a14:useLocalDpi xmlns:a14="http://schemas.microsoft.com/office/drawing/2010/main" val="0"/>
@@ -1083,7 +1133,7 @@
                   <pic:spPr>
                     <a:xfrm>
                       <a:off x="0" y="0"/>
-                      <a:ext cx="3512188" cy="4394561"/>
+                      <a:ext cx="3512188" cy="4385909"/>
                     </a:xfrm>
                     <a:prstGeom prst="rect">
                       <a:avLst/>
@@ -1167,6 +1217,37 @@
           <w:bCs/>
         </w:rPr>
         <w:t>Categorized Security Options Report</w:t>
+      </w:r>
+      <w:r>
+        <w:rPr>
+          <w:b/>
+          <w:bCs/>
+        </w:rPr>
+        <w:t xml:space="preserve"> </w:t>
+      </w:r>
+      <w:r>
+        <w:rPr>
+          <w:b/>
+          <w:bCs/>
+          <w:vertAlign w:val="superscript"/>
+        </w:rPr>
+        <w:t>[</w:t>
+      </w:r>
+      <w:r>
+        <w:rPr>
+          <w:b/>
+          <w:bCs/>
+          <w:vertAlign w:val="superscript"/>
+        </w:rPr>
+        <w:t>2</w:t>
+      </w:r>
+      <w:r>
+        <w:rPr>
+          <w:b/>
+          <w:bCs/>
+          <w:vertAlign w:val="superscript"/>
+        </w:rPr>
+        <w:t>]</w:t>
       </w:r>
       <w:r>
         <w:t xml:space="preserve"> is generated.</w:t>
@@ -1460,9 +1541,9 @@
           <w:noProof/>
         </w:rPr>
         <w:drawing>
-          <wp:inline distT="0" distB="0" distL="0" distR="0" wp14:anchorId="016DE709" wp14:editId="28005E49">
-            <wp:extent cx="4681489" cy="4387273"/>
-            <wp:effectExtent l="0" t="0" r="5080" b="0"/>
+          <wp:inline distT="0" distB="0" distL="0" distR="0" wp14:anchorId="016DE709" wp14:editId="5FFAB63B">
+            <wp:extent cx="4730858" cy="4424795"/>
+            <wp:effectExtent l="0" t="0" r="0" b="0"/>
             <wp:docPr id="4" name="Picture 4"/>
             <wp:cNvGraphicFramePr>
               <a:graphicFrameLocks xmlns:a="http://schemas.openxmlformats.org/drawingml/2006/main" noChangeAspect="1"/>
@@ -1475,7 +1556,7 @@
                     <pic:cNvPicPr/>
                   </pic:nvPicPr>
                   <pic:blipFill>
-                    <a:blip r:embed="rId11">
+                    <a:blip r:embed="rId11" cstate="print">
                       <a:extLst>
                         <a:ext uri="{28A0092B-C50C-407E-A947-70E740481C1C}">
                           <a14:useLocalDpi xmlns:a14="http://schemas.microsoft.com/office/drawing/2010/main" val="0"/>
@@ -1489,7 +1570,7 @@
                   <pic:spPr>
                     <a:xfrm>
                       <a:off x="0" y="0"/>
-                      <a:ext cx="4730858" cy="4433539"/>
+                      <a:ext cx="4730858" cy="4424795"/>
                     </a:xfrm>
                     <a:prstGeom prst="rect">
                       <a:avLst/>
@@ -1565,6 +1646,22 @@
         <w:t>Security Options Qualification Report</w:t>
       </w:r>
       <w:r>
+        <w:rPr>
+          <w:b/>
+          <w:bCs/>
+        </w:rPr>
+        <w:t xml:space="preserve"> </w:t>
+      </w:r>
+      <w:r>
+        <w:rPr>
+          <w:b/>
+          <w:bCs/>
+          <w:color w:val="0070C0"/>
+          <w:vertAlign w:val="superscript"/>
+        </w:rPr>
+        <w:t>[3]</w:t>
+      </w:r>
+      <w:r>
         <w:t xml:space="preserve"> is generated.</w:t>
       </w:r>
     </w:p>
@@ -1595,10 +1692,16 @@
         <w:tab/>
       </w:r>
       <w:r>
-        <w:t xml:space="preserve">If a </w:t>
-      </w:r>
-      <w:r>
-        <w:t>security option</w:t>
+        <w:t>If a</w:t>
+      </w:r>
+      <w:r>
+        <w:t>n</w:t>
+      </w:r>
+      <w:r>
+        <w:t xml:space="preserve"> </w:t>
+      </w:r>
+      <w:r>
+        <w:t>option</w:t>
       </w:r>
       <w:r>
         <w:t xml:space="preserve"> is not used, </w:t>
@@ -1615,14 +1718,6 @@
       <w:r>
         <w:t xml:space="preserve">. </w:t>
       </w:r>
-    </w:p>
-    <w:p>
-      <w:pPr>
-        <w:rPr>
-          <w:sz w:val="32"/>
-          <w:szCs w:val="32"/>
-        </w:rPr>
-      </w:pPr>
       <w:r>
         <w:br w:type="page"/>
       </w:r>
@@ -1891,8 +1986,8 @@
           <w:noProof/>
         </w:rPr>
         <w:drawing>
-          <wp:inline distT="0" distB="0" distL="0" distR="0" wp14:anchorId="14C8B1CE" wp14:editId="4C3608F0">
-            <wp:extent cx="4421887" cy="4387273"/>
+          <wp:inline distT="0" distB="0" distL="0" distR="0" wp14:anchorId="14C8B1CE" wp14:editId="18A3D3A2">
+            <wp:extent cx="4464154" cy="4420473"/>
             <wp:effectExtent l="0" t="0" r="0" b="0"/>
             <wp:docPr id="5" name="Picture 5"/>
             <wp:cNvGraphicFramePr>
@@ -1906,7 +2001,7 @@
                     <pic:cNvPicPr/>
                   </pic:nvPicPr>
                   <pic:blipFill>
-                    <a:blip r:embed="rId12">
+                    <a:blip r:embed="rId12" cstate="print">
                       <a:extLst>
                         <a:ext uri="{28A0092B-C50C-407E-A947-70E740481C1C}">
                           <a14:useLocalDpi xmlns:a14="http://schemas.microsoft.com/office/drawing/2010/main" val="0"/>
@@ -1920,7 +2015,7 @@
                   <pic:spPr>
                     <a:xfrm>
                       <a:off x="0" y="0"/>
-                      <a:ext cx="4464154" cy="4429209"/>
+                      <a:ext cx="4464154" cy="4420473"/>
                     </a:xfrm>
                     <a:prstGeom prst="rect">
                       <a:avLst/>
@@ -2004,14 +2099,6 @@
       <w:r>
         <w:t>.</w:t>
       </w:r>
-    </w:p>
-    <w:p>
-      <w:pPr>
-        <w:rPr>
-          <w:sz w:val="40"/>
-          <w:szCs w:val="40"/>
-        </w:rPr>
-      </w:pPr>
       <w:r>
         <w:br w:type="page"/>
       </w:r>
@@ -2206,7 +2293,7 @@
 </file>
 
 <file path=word/endnotes.xml><?xml version="1.0" encoding="utf-8"?>
-<w:endnotes xmlns:wpc="http://schemas.microsoft.com/office/word/2010/wordprocessingCanvas" xmlns:cx="http://schemas.microsoft.com/office/drawing/2014/chartex" xmlns:cx1="http://schemas.microsoft.com/office/drawing/2015/9/8/chartex" xmlns:cx2="http://schemas.microsoft.com/office/drawing/2015/10/21/chartex" xmlns:cx3="http://schemas.microsoft.com/office/drawing/2016/5/9/chartex" xmlns:cx4="http://schemas.microsoft.com/office/drawing/2016/5/10/chartex" xmlns:cx5="http://schemas.microsoft.com/office/drawing/2016/5/11/chartex" xmlns:cx6="http://schemas.microsoft.com/office/drawing/2016/5/12/chartex" xmlns:cx7="http://schemas.microsoft.com/office/drawing/2016/5/13/chartex" xmlns:cx8="http://schemas.microsoft.com/office/drawing/2016/5/14/chartex" xmlns:mc="http://schemas.openxmlformats.org/markup-compatibility/2006" xmlns:aink="http://schemas.microsoft.com/office/drawing/2016/ink" xmlns:am3d="http://schemas.microsoft.com/office/drawing/2017/model3d" xmlns:o="urn:schemas-microsoft-com:office:office" xmlns:oel="http://schemas.microsoft.com/office/2019/extlst" xmlns:r="http://schemas.openxmlformats.org/officeDocument/2006/relationships" xmlns:m="http://schemas.openxmlformats.org/officeDocument/2006/math" xmlns:v="urn:schemas-microsoft-com:vml" xmlns:wp14="http://schemas.microsoft.com/office/word/2010/wordprocessingDrawing" xmlns:wp="http://schemas.openxmlformats.org/drawingml/2006/wordprocessingDrawing" xmlns:w10="urn:schemas-microsoft-com:office:word" xmlns:w="http://schemas.openxmlformats.org/wordprocessingml/2006/main" xmlns:w14="http://schemas.microsoft.com/office/word/2010/wordml" xmlns:w15="http://schemas.microsoft.com/office/word/2012/wordml" xmlns:w16cex="http://schemas.microsoft.com/office/word/2018/wordml/cex" xmlns:w16cid="http://schemas.microsoft.com/office/word/2016/wordml/cid" xmlns:w16="http://schemas.microsoft.com/office/word/2018/wordml" xmlns:w16sdtdh="http://schemas.microsoft.com/office/word/2020/wordml/sdtdatahash" xmlns:w16se="http://schemas.microsoft.com/office/word/2015/wordml/symex" xmlns:wpg="http://schemas.microsoft.com/office/word/2010/wordprocessingGroup" xmlns:wpi="http://schemas.microsoft.com/office/word/2010/wordprocessingInk" xmlns:wne="http://schemas.microsoft.com/office/word/2006/wordml" xmlns:wps="http://schemas.microsoft.com/office/word/2010/wordprocessingShape" mc:Ignorable="w14 w15 w16se w16cid w16 w16cex w16sdtdh wp14">
+<w:endnotes xmlns:wpc="http://schemas.microsoft.com/office/word/2010/wordprocessingCanvas" xmlns:cx="http://schemas.microsoft.com/office/drawing/2014/chartex" xmlns:cx1="http://schemas.microsoft.com/office/drawing/2015/9/8/chartex" xmlns:cx2="http://schemas.microsoft.com/office/drawing/2015/10/21/chartex" xmlns:cx3="http://schemas.microsoft.com/office/drawing/2016/5/9/chartex" xmlns:cx4="http://schemas.microsoft.com/office/drawing/2016/5/10/chartex" xmlns:cx5="http://schemas.microsoft.com/office/drawing/2016/5/11/chartex" xmlns:cx6="http://schemas.microsoft.com/office/drawing/2016/5/12/chartex" xmlns:cx7="http://schemas.microsoft.com/office/drawing/2016/5/13/chartex" xmlns:cx8="http://schemas.microsoft.com/office/drawing/2016/5/14/chartex" xmlns:mc="http://schemas.openxmlformats.org/markup-compatibility/2006" xmlns:aink="http://schemas.microsoft.com/office/drawing/2016/ink" xmlns:am3d="http://schemas.microsoft.com/office/drawing/2017/model3d" xmlns:o="urn:schemas-microsoft-com:office:office" xmlns:oel="http://schemas.microsoft.com/office/2019/extlst" xmlns:r="http://schemas.openxmlformats.org/officeDocument/2006/relationships" xmlns:m="http://schemas.openxmlformats.org/officeDocument/2006/math" xmlns:v="urn:schemas-microsoft-com:vml" xmlns:wp14="http://schemas.microsoft.com/office/word/2010/wordprocessingDrawing" xmlns:wp="http://schemas.openxmlformats.org/drawingml/2006/wordprocessingDrawing" xmlns:w10="urn:schemas-microsoft-com:office:word" xmlns:w="http://schemas.openxmlformats.org/wordprocessingml/2006/main" xmlns:w14="http://schemas.microsoft.com/office/word/2010/wordml" xmlns:w15="http://schemas.microsoft.com/office/word/2012/wordml" xmlns:w16cex="http://schemas.microsoft.com/office/word/2018/wordml/cex" xmlns:w16cid="http://schemas.microsoft.com/office/word/2016/wordml/cid" xmlns:w16="http://schemas.microsoft.com/office/word/2018/wordml" xmlns:w16du="http://schemas.microsoft.com/office/word/2023/wordml/word16du" xmlns:w16sdtdh="http://schemas.microsoft.com/office/word/2020/wordml/sdtdatahash" xmlns:w16sdtfl="http://schemas.microsoft.com/office/word/2024/wordml/sdtformatlock" xmlns:w16se="http://schemas.microsoft.com/office/word/2015/wordml/symex" xmlns:wpg="http://schemas.microsoft.com/office/word/2010/wordprocessingGroup" xmlns:wpi="http://schemas.microsoft.com/office/word/2010/wordprocessingInk" xmlns:wne="http://schemas.microsoft.com/office/word/2006/wordml" xmlns:wps="http://schemas.microsoft.com/office/word/2010/wordprocessingShape" mc:Ignorable="w14 w15 w16se w16cid w16 w16cex w16sdtdh w16sdtfl w16du wp14">
   <w:endnote w:type="separator" w:id="-1">
     <w:p>
       <w:pPr>
@@ -2231,7 +2318,7 @@
 </file>
 
 <file path=word/footer1.xml><?xml version="1.0" encoding="utf-8"?>
-<w:ftr xmlns:wpc="http://schemas.microsoft.com/office/word/2010/wordprocessingCanvas" xmlns:cx="http://schemas.microsoft.com/office/drawing/2014/chartex" xmlns:cx1="http://schemas.microsoft.com/office/drawing/2015/9/8/chartex" xmlns:cx2="http://schemas.microsoft.com/office/drawing/2015/10/21/chartex" xmlns:cx3="http://schemas.microsoft.com/office/drawing/2016/5/9/chartex" xmlns:cx4="http://schemas.microsoft.com/office/drawing/2016/5/10/chartex" xmlns:cx5="http://schemas.microsoft.com/office/drawing/2016/5/11/chartex" xmlns:cx6="http://schemas.microsoft.com/office/drawing/2016/5/12/chartex" xmlns:cx7="http://schemas.microsoft.com/office/drawing/2016/5/13/chartex" xmlns:cx8="http://schemas.microsoft.com/office/drawing/2016/5/14/chartex" xmlns:mc="http://schemas.openxmlformats.org/markup-compatibility/2006" xmlns:aink="http://schemas.microsoft.com/office/drawing/2016/ink" xmlns:am3d="http://schemas.microsoft.com/office/drawing/2017/model3d" xmlns:o="urn:schemas-microsoft-com:office:office" xmlns:oel="http://schemas.microsoft.com/office/2019/extlst" xmlns:r="http://schemas.openxmlformats.org/officeDocument/2006/relationships" xmlns:m="http://schemas.openxmlformats.org/officeDocument/2006/math" xmlns:v="urn:schemas-microsoft-com:vml" xmlns:wp14="http://schemas.microsoft.com/office/word/2010/wordprocessingDrawing" xmlns:wp="http://schemas.openxmlformats.org/drawingml/2006/wordprocessingDrawing" xmlns:w10="urn:schemas-microsoft-com:office:word" xmlns:w="http://schemas.openxmlformats.org/wordprocessingml/2006/main" xmlns:w14="http://schemas.microsoft.com/office/word/2010/wordml" xmlns:w15="http://schemas.microsoft.com/office/word/2012/wordml" xmlns:w16cex="http://schemas.microsoft.com/office/word/2018/wordml/cex" xmlns:w16cid="http://schemas.microsoft.com/office/word/2016/wordml/cid" xmlns:w16="http://schemas.microsoft.com/office/word/2018/wordml" xmlns:w16sdtdh="http://schemas.microsoft.com/office/word/2020/wordml/sdtdatahash" xmlns:w16se="http://schemas.microsoft.com/office/word/2015/wordml/symex" xmlns:wpg="http://schemas.microsoft.com/office/word/2010/wordprocessingGroup" xmlns:wpi="http://schemas.microsoft.com/office/word/2010/wordprocessingInk" xmlns:wne="http://schemas.microsoft.com/office/word/2006/wordml" xmlns:wps="http://schemas.microsoft.com/office/word/2010/wordprocessingShape" mc:Ignorable="w14 w15 w16se w16cid w16 w16cex w16sdtdh wp14">
+<w:ftr xmlns:wpc="http://schemas.microsoft.com/office/word/2010/wordprocessingCanvas" xmlns:cx="http://schemas.microsoft.com/office/drawing/2014/chartex" xmlns:cx1="http://schemas.microsoft.com/office/drawing/2015/9/8/chartex" xmlns:cx2="http://schemas.microsoft.com/office/drawing/2015/10/21/chartex" xmlns:cx3="http://schemas.microsoft.com/office/drawing/2016/5/9/chartex" xmlns:cx4="http://schemas.microsoft.com/office/drawing/2016/5/10/chartex" xmlns:cx5="http://schemas.microsoft.com/office/drawing/2016/5/11/chartex" xmlns:cx6="http://schemas.microsoft.com/office/drawing/2016/5/12/chartex" xmlns:cx7="http://schemas.microsoft.com/office/drawing/2016/5/13/chartex" xmlns:cx8="http://schemas.microsoft.com/office/drawing/2016/5/14/chartex" xmlns:mc="http://schemas.openxmlformats.org/markup-compatibility/2006" xmlns:aink="http://schemas.microsoft.com/office/drawing/2016/ink" xmlns:am3d="http://schemas.microsoft.com/office/drawing/2017/model3d" xmlns:o="urn:schemas-microsoft-com:office:office" xmlns:oel="http://schemas.microsoft.com/office/2019/extlst" xmlns:r="http://schemas.openxmlformats.org/officeDocument/2006/relationships" xmlns:m="http://schemas.openxmlformats.org/officeDocument/2006/math" xmlns:v="urn:schemas-microsoft-com:vml" xmlns:wp14="http://schemas.microsoft.com/office/word/2010/wordprocessingDrawing" xmlns:wp="http://schemas.openxmlformats.org/drawingml/2006/wordprocessingDrawing" xmlns:w10="urn:schemas-microsoft-com:office:word" xmlns:w="http://schemas.openxmlformats.org/wordprocessingml/2006/main" xmlns:w14="http://schemas.microsoft.com/office/word/2010/wordml" xmlns:w15="http://schemas.microsoft.com/office/word/2012/wordml" xmlns:w16cex="http://schemas.microsoft.com/office/word/2018/wordml/cex" xmlns:w16cid="http://schemas.microsoft.com/office/word/2016/wordml/cid" xmlns:w16="http://schemas.microsoft.com/office/word/2018/wordml" xmlns:w16du="http://schemas.microsoft.com/office/word/2023/wordml/word16du" xmlns:w16sdtdh="http://schemas.microsoft.com/office/word/2020/wordml/sdtdatahash" xmlns:w16sdtfl="http://schemas.microsoft.com/office/word/2024/wordml/sdtformatlock" xmlns:w16se="http://schemas.microsoft.com/office/word/2015/wordml/symex" xmlns:wpg="http://schemas.microsoft.com/office/word/2010/wordprocessingGroup" xmlns:wpi="http://schemas.microsoft.com/office/word/2010/wordprocessingInk" xmlns:wne="http://schemas.microsoft.com/office/word/2006/wordml" xmlns:wps="http://schemas.microsoft.com/office/word/2010/wordprocessingShape" mc:Ignorable="w14 w15 w16se w16cid w16 w16cex w16sdtdh w16sdtfl w16du wp14">
   <w:sdt>
     <w:sdtPr>
       <w:rPr>
@@ -2283,7 +2370,7 @@
 </file>
 
 <file path=word/footer2.xml><?xml version="1.0" encoding="utf-8"?>
-<w:ftr xmlns:wpc="http://schemas.microsoft.com/office/word/2010/wordprocessingCanvas" xmlns:cx="http://schemas.microsoft.com/office/drawing/2014/chartex" xmlns:cx1="http://schemas.microsoft.com/office/drawing/2015/9/8/chartex" xmlns:cx2="http://schemas.microsoft.com/office/drawing/2015/10/21/chartex" xmlns:cx3="http://schemas.microsoft.com/office/drawing/2016/5/9/chartex" xmlns:cx4="http://schemas.microsoft.com/office/drawing/2016/5/10/chartex" xmlns:cx5="http://schemas.microsoft.com/office/drawing/2016/5/11/chartex" xmlns:cx6="http://schemas.microsoft.com/office/drawing/2016/5/12/chartex" xmlns:cx7="http://schemas.microsoft.com/office/drawing/2016/5/13/chartex" xmlns:cx8="http://schemas.microsoft.com/office/drawing/2016/5/14/chartex" xmlns:mc="http://schemas.openxmlformats.org/markup-compatibility/2006" xmlns:aink="http://schemas.microsoft.com/office/drawing/2016/ink" xmlns:am3d="http://schemas.microsoft.com/office/drawing/2017/model3d" xmlns:o="urn:schemas-microsoft-com:office:office" xmlns:oel="http://schemas.microsoft.com/office/2019/extlst" xmlns:r="http://schemas.openxmlformats.org/officeDocument/2006/relationships" xmlns:m="http://schemas.openxmlformats.org/officeDocument/2006/math" xmlns:v="urn:schemas-microsoft-com:vml" xmlns:wp14="http://schemas.microsoft.com/office/word/2010/wordprocessingDrawing" xmlns:wp="http://schemas.openxmlformats.org/drawingml/2006/wordprocessingDrawing" xmlns:w10="urn:schemas-microsoft-com:office:word" xmlns:w="http://schemas.openxmlformats.org/wordprocessingml/2006/main" xmlns:w14="http://schemas.microsoft.com/office/word/2010/wordml" xmlns:w15="http://schemas.microsoft.com/office/word/2012/wordml" xmlns:w16cex="http://schemas.microsoft.com/office/word/2018/wordml/cex" xmlns:w16cid="http://schemas.microsoft.com/office/word/2016/wordml/cid" xmlns:w16="http://schemas.microsoft.com/office/word/2018/wordml" xmlns:w16sdtdh="http://schemas.microsoft.com/office/word/2020/wordml/sdtdatahash" xmlns:w16se="http://schemas.microsoft.com/office/word/2015/wordml/symex" xmlns:wpg="http://schemas.microsoft.com/office/word/2010/wordprocessingGroup" xmlns:wpi="http://schemas.microsoft.com/office/word/2010/wordprocessingInk" xmlns:wne="http://schemas.microsoft.com/office/word/2006/wordml" xmlns:wps="http://schemas.microsoft.com/office/word/2010/wordprocessingShape" mc:Ignorable="w14 w15 w16se w16cid w16 w16cex w16sdtdh wp14">
+<w:ftr xmlns:wpc="http://schemas.microsoft.com/office/word/2010/wordprocessingCanvas" xmlns:cx="http://schemas.microsoft.com/office/drawing/2014/chartex" xmlns:cx1="http://schemas.microsoft.com/office/drawing/2015/9/8/chartex" xmlns:cx2="http://schemas.microsoft.com/office/drawing/2015/10/21/chartex" xmlns:cx3="http://schemas.microsoft.com/office/drawing/2016/5/9/chartex" xmlns:cx4="http://schemas.microsoft.com/office/drawing/2016/5/10/chartex" xmlns:cx5="http://schemas.microsoft.com/office/drawing/2016/5/11/chartex" xmlns:cx6="http://schemas.microsoft.com/office/drawing/2016/5/12/chartex" xmlns:cx7="http://schemas.microsoft.com/office/drawing/2016/5/13/chartex" xmlns:cx8="http://schemas.microsoft.com/office/drawing/2016/5/14/chartex" xmlns:mc="http://schemas.openxmlformats.org/markup-compatibility/2006" xmlns:aink="http://schemas.microsoft.com/office/drawing/2016/ink" xmlns:am3d="http://schemas.microsoft.com/office/drawing/2017/model3d" xmlns:o="urn:schemas-microsoft-com:office:office" xmlns:oel="http://schemas.microsoft.com/office/2019/extlst" xmlns:r="http://schemas.openxmlformats.org/officeDocument/2006/relationships" xmlns:m="http://schemas.openxmlformats.org/officeDocument/2006/math" xmlns:v="urn:schemas-microsoft-com:vml" xmlns:wp14="http://schemas.microsoft.com/office/word/2010/wordprocessingDrawing" xmlns:wp="http://schemas.openxmlformats.org/drawingml/2006/wordprocessingDrawing" xmlns:w10="urn:schemas-microsoft-com:office:word" xmlns:w="http://schemas.openxmlformats.org/wordprocessingml/2006/main" xmlns:w14="http://schemas.microsoft.com/office/word/2010/wordml" xmlns:w15="http://schemas.microsoft.com/office/word/2012/wordml" xmlns:w16cex="http://schemas.microsoft.com/office/word/2018/wordml/cex" xmlns:w16cid="http://schemas.microsoft.com/office/word/2016/wordml/cid" xmlns:w16="http://schemas.microsoft.com/office/word/2018/wordml" xmlns:w16du="http://schemas.microsoft.com/office/word/2023/wordml/word16du" xmlns:w16sdtdh="http://schemas.microsoft.com/office/word/2020/wordml/sdtdatahash" xmlns:w16sdtfl="http://schemas.microsoft.com/office/word/2024/wordml/sdtformatlock" xmlns:w16se="http://schemas.microsoft.com/office/word/2015/wordml/symex" xmlns:wpg="http://schemas.microsoft.com/office/word/2010/wordprocessingGroup" xmlns:wpi="http://schemas.microsoft.com/office/word/2010/wordprocessingInk" xmlns:wne="http://schemas.microsoft.com/office/word/2006/wordml" xmlns:wps="http://schemas.microsoft.com/office/word/2010/wordprocessingShape" mc:Ignorable="w14 w15 w16se w16cid w16 w16cex w16sdtdh w16sdtfl w16du wp14">
   <w:sdt>
     <w:sdtPr>
       <w:rPr>
@@ -2348,7 +2435,7 @@
 </file>
 
 <file path=word/footnotes.xml><?xml version="1.0" encoding="utf-8"?>
-<w:footnotes xmlns:wpc="http://schemas.microsoft.com/office/word/2010/wordprocessingCanvas" xmlns:cx="http://schemas.microsoft.com/office/drawing/2014/chartex" xmlns:cx1="http://schemas.microsoft.com/office/drawing/2015/9/8/chartex" xmlns:cx2="http://schemas.microsoft.com/office/drawing/2015/10/21/chartex" xmlns:cx3="http://schemas.microsoft.com/office/drawing/2016/5/9/chartex" xmlns:cx4="http://schemas.microsoft.com/office/drawing/2016/5/10/chartex" xmlns:cx5="http://schemas.microsoft.com/office/drawing/2016/5/11/chartex" xmlns:cx6="http://schemas.microsoft.com/office/drawing/2016/5/12/chartex" xmlns:cx7="http://schemas.microsoft.com/office/drawing/2016/5/13/chartex" xmlns:cx8="http://schemas.microsoft.com/office/drawing/2016/5/14/chartex" xmlns:mc="http://schemas.openxmlformats.org/markup-compatibility/2006" xmlns:aink="http://schemas.microsoft.com/office/drawing/2016/ink" xmlns:am3d="http://schemas.microsoft.com/office/drawing/2017/model3d" xmlns:o="urn:schemas-microsoft-com:office:office" xmlns:oel="http://schemas.microsoft.com/office/2019/extlst" xmlns:r="http://schemas.openxmlformats.org/officeDocument/2006/relationships" xmlns:m="http://schemas.openxmlformats.org/officeDocument/2006/math" xmlns:v="urn:schemas-microsoft-com:vml" xmlns:wp14="http://schemas.microsoft.com/office/word/2010/wordprocessingDrawing" xmlns:wp="http://schemas.openxmlformats.org/drawingml/2006/wordprocessingDrawing" xmlns:w10="urn:schemas-microsoft-com:office:word" xmlns:w="http://schemas.openxmlformats.org/wordprocessingml/2006/main" xmlns:w14="http://schemas.microsoft.com/office/word/2010/wordml" xmlns:w15="http://schemas.microsoft.com/office/word/2012/wordml" xmlns:w16cex="http://schemas.microsoft.com/office/word/2018/wordml/cex" xmlns:w16cid="http://schemas.microsoft.com/office/word/2016/wordml/cid" xmlns:w16="http://schemas.microsoft.com/office/word/2018/wordml" xmlns:w16sdtdh="http://schemas.microsoft.com/office/word/2020/wordml/sdtdatahash" xmlns:w16se="http://schemas.microsoft.com/office/word/2015/wordml/symex" xmlns:wpg="http://schemas.microsoft.com/office/word/2010/wordprocessingGroup" xmlns:wpi="http://schemas.microsoft.com/office/word/2010/wordprocessingInk" xmlns:wne="http://schemas.microsoft.com/office/word/2006/wordml" xmlns:wps="http://schemas.microsoft.com/office/word/2010/wordprocessingShape" mc:Ignorable="w14 w15 w16se w16cid w16 w16cex w16sdtdh wp14">
+<w:footnotes xmlns:wpc="http://schemas.microsoft.com/office/word/2010/wordprocessingCanvas" xmlns:cx="http://schemas.microsoft.com/office/drawing/2014/chartex" xmlns:cx1="http://schemas.microsoft.com/office/drawing/2015/9/8/chartex" xmlns:cx2="http://schemas.microsoft.com/office/drawing/2015/10/21/chartex" xmlns:cx3="http://schemas.microsoft.com/office/drawing/2016/5/9/chartex" xmlns:cx4="http://schemas.microsoft.com/office/drawing/2016/5/10/chartex" xmlns:cx5="http://schemas.microsoft.com/office/drawing/2016/5/11/chartex" xmlns:cx6="http://schemas.microsoft.com/office/drawing/2016/5/12/chartex" xmlns:cx7="http://schemas.microsoft.com/office/drawing/2016/5/13/chartex" xmlns:cx8="http://schemas.microsoft.com/office/drawing/2016/5/14/chartex" xmlns:mc="http://schemas.openxmlformats.org/markup-compatibility/2006" xmlns:aink="http://schemas.microsoft.com/office/drawing/2016/ink" xmlns:am3d="http://schemas.microsoft.com/office/drawing/2017/model3d" xmlns:o="urn:schemas-microsoft-com:office:office" xmlns:oel="http://schemas.microsoft.com/office/2019/extlst" xmlns:r="http://schemas.openxmlformats.org/officeDocument/2006/relationships" xmlns:m="http://schemas.openxmlformats.org/officeDocument/2006/math" xmlns:v="urn:schemas-microsoft-com:vml" xmlns:wp14="http://schemas.microsoft.com/office/word/2010/wordprocessingDrawing" xmlns:wp="http://schemas.openxmlformats.org/drawingml/2006/wordprocessingDrawing" xmlns:w10="urn:schemas-microsoft-com:office:word" xmlns:w="http://schemas.openxmlformats.org/wordprocessingml/2006/main" xmlns:w14="http://schemas.microsoft.com/office/word/2010/wordml" xmlns:w15="http://schemas.microsoft.com/office/word/2012/wordml" xmlns:w16cex="http://schemas.microsoft.com/office/word/2018/wordml/cex" xmlns:w16cid="http://schemas.microsoft.com/office/word/2016/wordml/cid" xmlns:w16="http://schemas.microsoft.com/office/word/2018/wordml" xmlns:w16du="http://schemas.microsoft.com/office/word/2023/wordml/word16du" xmlns:w16sdtdh="http://schemas.microsoft.com/office/word/2020/wordml/sdtdatahash" xmlns:w16sdtfl="http://schemas.microsoft.com/office/word/2024/wordml/sdtformatlock" xmlns:w16se="http://schemas.microsoft.com/office/word/2015/wordml/symex" xmlns:wpg="http://schemas.microsoft.com/office/word/2010/wordprocessingGroup" xmlns:wpi="http://schemas.microsoft.com/office/word/2010/wordprocessingInk" xmlns:wne="http://schemas.microsoft.com/office/word/2006/wordml" xmlns:wps="http://schemas.microsoft.com/office/word/2010/wordprocessingShape" mc:Ignorable="w14 w15 w16se w16cid w16 w16cex w16sdtdh w16sdtfl w16du wp14">
   <w:footnote w:type="separator" w:id="-1">
     <w:p>
       <w:pPr>
@@ -2373,7 +2460,7 @@
 </file>
 
 <file path=word/header1.xml><?xml version="1.0" encoding="utf-8"?>
-<w:hdr xmlns:wpc="http://schemas.microsoft.com/office/word/2010/wordprocessingCanvas" xmlns:cx="http://schemas.microsoft.com/office/drawing/2014/chartex" xmlns:cx1="http://schemas.microsoft.com/office/drawing/2015/9/8/chartex" xmlns:cx2="http://schemas.microsoft.com/office/drawing/2015/10/21/chartex" xmlns:cx3="http://schemas.microsoft.com/office/drawing/2016/5/9/chartex" xmlns:cx4="http://schemas.microsoft.com/office/drawing/2016/5/10/chartex" xmlns:cx5="http://schemas.microsoft.com/office/drawing/2016/5/11/chartex" xmlns:cx6="http://schemas.microsoft.com/office/drawing/2016/5/12/chartex" xmlns:cx7="http://schemas.microsoft.com/office/drawing/2016/5/13/chartex" xmlns:cx8="http://schemas.microsoft.com/office/drawing/2016/5/14/chartex" xmlns:mc="http://schemas.openxmlformats.org/markup-compatibility/2006" xmlns:aink="http://schemas.microsoft.com/office/drawing/2016/ink" xmlns:am3d="http://schemas.microsoft.com/office/drawing/2017/model3d" xmlns:o="urn:schemas-microsoft-com:office:office" xmlns:oel="http://schemas.microsoft.com/office/2019/extlst" xmlns:r="http://schemas.openxmlformats.org/officeDocument/2006/relationships" xmlns:m="http://schemas.openxmlformats.org/officeDocument/2006/math" xmlns:v="urn:schemas-microsoft-com:vml" xmlns:wp14="http://schemas.microsoft.com/office/word/2010/wordprocessingDrawing" xmlns:wp="http://schemas.openxmlformats.org/drawingml/2006/wordprocessingDrawing" xmlns:w10="urn:schemas-microsoft-com:office:word" xmlns:w="http://schemas.openxmlformats.org/wordprocessingml/2006/main" xmlns:w14="http://schemas.microsoft.com/office/word/2010/wordml" xmlns:w15="http://schemas.microsoft.com/office/word/2012/wordml" xmlns:w16cex="http://schemas.microsoft.com/office/word/2018/wordml/cex" xmlns:w16cid="http://schemas.microsoft.com/office/word/2016/wordml/cid" xmlns:w16="http://schemas.microsoft.com/office/word/2018/wordml" xmlns:w16sdtdh="http://schemas.microsoft.com/office/word/2020/wordml/sdtdatahash" xmlns:w16se="http://schemas.microsoft.com/office/word/2015/wordml/symex" xmlns:wpg="http://schemas.microsoft.com/office/word/2010/wordprocessingGroup" xmlns:wpi="http://schemas.microsoft.com/office/word/2010/wordprocessingInk" xmlns:wne="http://schemas.microsoft.com/office/word/2006/wordml" xmlns:wps="http://schemas.microsoft.com/office/word/2010/wordprocessingShape" mc:Ignorable="w14 w15 w16se w16cid w16 w16cex w16sdtdh wp14">
+<w:hdr xmlns:wpc="http://schemas.microsoft.com/office/word/2010/wordprocessingCanvas" xmlns:cx="http://schemas.microsoft.com/office/drawing/2014/chartex" xmlns:cx1="http://schemas.microsoft.com/office/drawing/2015/9/8/chartex" xmlns:cx2="http://schemas.microsoft.com/office/drawing/2015/10/21/chartex" xmlns:cx3="http://schemas.microsoft.com/office/drawing/2016/5/9/chartex" xmlns:cx4="http://schemas.microsoft.com/office/drawing/2016/5/10/chartex" xmlns:cx5="http://schemas.microsoft.com/office/drawing/2016/5/11/chartex" xmlns:cx6="http://schemas.microsoft.com/office/drawing/2016/5/12/chartex" xmlns:cx7="http://schemas.microsoft.com/office/drawing/2016/5/13/chartex" xmlns:cx8="http://schemas.microsoft.com/office/drawing/2016/5/14/chartex" xmlns:mc="http://schemas.openxmlformats.org/markup-compatibility/2006" xmlns:aink="http://schemas.microsoft.com/office/drawing/2016/ink" xmlns:am3d="http://schemas.microsoft.com/office/drawing/2017/model3d" xmlns:o="urn:schemas-microsoft-com:office:office" xmlns:oel="http://schemas.microsoft.com/office/2019/extlst" xmlns:r="http://schemas.openxmlformats.org/officeDocument/2006/relationships" xmlns:m="http://schemas.openxmlformats.org/officeDocument/2006/math" xmlns:v="urn:schemas-microsoft-com:vml" xmlns:wp14="http://schemas.microsoft.com/office/word/2010/wordprocessingDrawing" xmlns:wp="http://schemas.openxmlformats.org/drawingml/2006/wordprocessingDrawing" xmlns:w10="urn:schemas-microsoft-com:office:word" xmlns:w="http://schemas.openxmlformats.org/wordprocessingml/2006/main" xmlns:w14="http://schemas.microsoft.com/office/word/2010/wordml" xmlns:w15="http://schemas.microsoft.com/office/word/2012/wordml" xmlns:w16cex="http://schemas.microsoft.com/office/word/2018/wordml/cex" xmlns:w16cid="http://schemas.microsoft.com/office/word/2016/wordml/cid" xmlns:w16="http://schemas.microsoft.com/office/word/2018/wordml" xmlns:w16du="http://schemas.microsoft.com/office/word/2023/wordml/word16du" xmlns:w16sdtdh="http://schemas.microsoft.com/office/word/2020/wordml/sdtdatahash" xmlns:w16sdtfl="http://schemas.microsoft.com/office/word/2024/wordml/sdtformatlock" xmlns:w16se="http://schemas.microsoft.com/office/word/2015/wordml/symex" xmlns:wpg="http://schemas.microsoft.com/office/word/2010/wordprocessingGroup" xmlns:wpi="http://schemas.microsoft.com/office/word/2010/wordprocessingInk" xmlns:wne="http://schemas.microsoft.com/office/word/2006/wordml" xmlns:wps="http://schemas.microsoft.com/office/word/2010/wordprocessingShape" mc:Ignorable="w14 w15 w16se w16cid w16 w16cex w16sdtdh w16sdtfl w16du wp14">
   <w:p>
     <w:pPr>
       <w:pStyle w:val="Header"/>
@@ -2390,7 +2477,7 @@
 </file>
 
 <file path=word/numbering.xml><?xml version="1.0" encoding="utf-8"?>
-<w:numbering xmlns:wpc="http://schemas.microsoft.com/office/word/2010/wordprocessingCanvas" xmlns:cx="http://schemas.microsoft.com/office/drawing/2014/chartex" xmlns:cx1="http://schemas.microsoft.com/office/drawing/2015/9/8/chartex" xmlns:cx2="http://schemas.microsoft.com/office/drawing/2015/10/21/chartex" xmlns:cx3="http://schemas.microsoft.com/office/drawing/2016/5/9/chartex" xmlns:cx4="http://schemas.microsoft.com/office/drawing/2016/5/10/chartex" xmlns:cx5="http://schemas.microsoft.com/office/drawing/2016/5/11/chartex" xmlns:cx6="http://schemas.microsoft.com/office/drawing/2016/5/12/chartex" xmlns:cx7="http://schemas.microsoft.com/office/drawing/2016/5/13/chartex" xmlns:cx8="http://schemas.microsoft.com/office/drawing/2016/5/14/chartex" xmlns:mc="http://schemas.openxmlformats.org/markup-compatibility/2006" xmlns:aink="http://schemas.microsoft.com/office/drawing/2016/ink" xmlns:am3d="http://schemas.microsoft.com/office/drawing/2017/model3d" xmlns:o="urn:schemas-microsoft-com:office:office" xmlns:oel="http://schemas.microsoft.com/office/2019/extlst" xmlns:r="http://schemas.openxmlformats.org/officeDocument/2006/relationships" xmlns:m="http://schemas.openxmlformats.org/officeDocument/2006/math" xmlns:v="urn:schemas-microsoft-com:vml" xmlns:wp14="http://schemas.microsoft.com/office/word/2010/wordprocessingDrawing" xmlns:wp="http://schemas.openxmlformats.org/drawingml/2006/wordprocessingDrawing" xmlns:w10="urn:schemas-microsoft-com:office:word" xmlns:w="http://schemas.openxmlformats.org/wordprocessingml/2006/main" xmlns:w14="http://schemas.microsoft.com/office/word/2010/wordml" xmlns:w15="http://schemas.microsoft.com/office/word/2012/wordml" xmlns:w16cex="http://schemas.microsoft.com/office/word/2018/wordml/cex" xmlns:w16cid="http://schemas.microsoft.com/office/word/2016/wordml/cid" xmlns:w16="http://schemas.microsoft.com/office/word/2018/wordml" xmlns:w16sdtdh="http://schemas.microsoft.com/office/word/2020/wordml/sdtdatahash" xmlns:w16se="http://schemas.microsoft.com/office/word/2015/wordml/symex" xmlns:wpg="http://schemas.microsoft.com/office/word/2010/wordprocessingGroup" xmlns:wpi="http://schemas.microsoft.com/office/word/2010/wordprocessingInk" xmlns:wne="http://schemas.microsoft.com/office/word/2006/wordml" xmlns:wps="http://schemas.microsoft.com/office/word/2010/wordprocessingShape" mc:Ignorable="w14 w15 w16se w16cid w16 w16cex w16sdtdh wp14">
+<w:numbering xmlns:wpc="http://schemas.microsoft.com/office/word/2010/wordprocessingCanvas" xmlns:cx="http://schemas.microsoft.com/office/drawing/2014/chartex" xmlns:cx1="http://schemas.microsoft.com/office/drawing/2015/9/8/chartex" xmlns:cx2="http://schemas.microsoft.com/office/drawing/2015/10/21/chartex" xmlns:cx3="http://schemas.microsoft.com/office/drawing/2016/5/9/chartex" xmlns:cx4="http://schemas.microsoft.com/office/drawing/2016/5/10/chartex" xmlns:cx5="http://schemas.microsoft.com/office/drawing/2016/5/11/chartex" xmlns:cx6="http://schemas.microsoft.com/office/drawing/2016/5/12/chartex" xmlns:cx7="http://schemas.microsoft.com/office/drawing/2016/5/13/chartex" xmlns:cx8="http://schemas.microsoft.com/office/drawing/2016/5/14/chartex" xmlns:mc="http://schemas.openxmlformats.org/markup-compatibility/2006" xmlns:aink="http://schemas.microsoft.com/office/drawing/2016/ink" xmlns:am3d="http://schemas.microsoft.com/office/drawing/2017/model3d" xmlns:o="urn:schemas-microsoft-com:office:office" xmlns:oel="http://schemas.microsoft.com/office/2019/extlst" xmlns:r="http://schemas.openxmlformats.org/officeDocument/2006/relationships" xmlns:m="http://schemas.openxmlformats.org/officeDocument/2006/math" xmlns:v="urn:schemas-microsoft-com:vml" xmlns:wp14="http://schemas.microsoft.com/office/word/2010/wordprocessingDrawing" xmlns:wp="http://schemas.openxmlformats.org/drawingml/2006/wordprocessingDrawing" xmlns:w10="urn:schemas-microsoft-com:office:word" xmlns:w="http://schemas.openxmlformats.org/wordprocessingml/2006/main" xmlns:w14="http://schemas.microsoft.com/office/word/2010/wordml" xmlns:w15="http://schemas.microsoft.com/office/word/2012/wordml" xmlns:w16cex="http://schemas.microsoft.com/office/word/2018/wordml/cex" xmlns:w16cid="http://schemas.microsoft.com/office/word/2016/wordml/cid" xmlns:w16="http://schemas.microsoft.com/office/word/2018/wordml" xmlns:w16du="http://schemas.microsoft.com/office/word/2023/wordml/word16du" xmlns:w16sdtdh="http://schemas.microsoft.com/office/word/2020/wordml/sdtdatahash" xmlns:w16sdtfl="http://schemas.microsoft.com/office/word/2024/wordml/sdtformatlock" xmlns:w16se="http://schemas.microsoft.com/office/word/2015/wordml/symex" xmlns:wpg="http://schemas.microsoft.com/office/word/2010/wordprocessingGroup" xmlns:wpi="http://schemas.microsoft.com/office/word/2010/wordprocessingInk" xmlns:wne="http://schemas.microsoft.com/office/word/2006/wordml" xmlns:wps="http://schemas.microsoft.com/office/word/2010/wordprocessingShape" mc:Ignorable="w14 w15 w16se w16cid w16 w16cex w16sdtdh w16sdtfl w16du wp14">
   <w:abstractNum w:abstractNumId="0" w15:restartNumberingAfterBreak="0">
     <w:nsid w:val="65400E2A"/>
     <w:multiLevelType w:val="hybridMultilevel"/>
@@ -2600,7 +2687,7 @@
 </file>
 
 <file path=word/styles.xml><?xml version="1.0" encoding="utf-8"?>
-<w:styles xmlns:mc="http://schemas.openxmlformats.org/markup-compatibility/2006" xmlns:r="http://schemas.openxmlformats.org/officeDocument/2006/relationships" xmlns:w="http://schemas.openxmlformats.org/wordprocessingml/2006/main" xmlns:w14="http://schemas.microsoft.com/office/word/2010/wordml" xmlns:w15="http://schemas.microsoft.com/office/word/2012/wordml" xmlns:w16cex="http://schemas.microsoft.com/office/word/2018/wordml/cex" xmlns:w16cid="http://schemas.microsoft.com/office/word/2016/wordml/cid" xmlns:w16="http://schemas.microsoft.com/office/word/2018/wordml" xmlns:w16sdtdh="http://schemas.microsoft.com/office/word/2020/wordml/sdtdatahash" xmlns:w16se="http://schemas.microsoft.com/office/word/2015/wordml/symex" mc:Ignorable="w14 w15 w16se w16cid w16 w16cex w16sdtdh">
+<w:styles xmlns:mc="http://schemas.openxmlformats.org/markup-compatibility/2006" xmlns:r="http://schemas.openxmlformats.org/officeDocument/2006/relationships" xmlns:w="http://schemas.openxmlformats.org/wordprocessingml/2006/main" xmlns:w14="http://schemas.microsoft.com/office/word/2010/wordml" xmlns:w15="http://schemas.microsoft.com/office/word/2012/wordml" xmlns:w16cex="http://schemas.microsoft.com/office/word/2018/wordml/cex" xmlns:w16cid="http://schemas.microsoft.com/office/word/2016/wordml/cid" xmlns:w16="http://schemas.microsoft.com/office/word/2018/wordml" xmlns:w16du="http://schemas.microsoft.com/office/word/2023/wordml/word16du" xmlns:w16sdtdh="http://schemas.microsoft.com/office/word/2020/wordml/sdtdatahash" xmlns:w16sdtfl="http://schemas.microsoft.com/office/word/2024/wordml/sdtformatlock" xmlns:w16se="http://schemas.microsoft.com/office/word/2015/wordml/symex" mc:Ignorable="w14 w15 w16se w16cid w16 w16cex w16sdtdh w16sdtfl w16du">
   <w:docDefaults>
     <w:rPrDefault>
       <w:rPr>
@@ -3175,9 +3262,14 @@
     <w:name w:val="Hyperlink"/>
     <w:basedOn w:val="DefaultParagraphFont"/>
     <w:uiPriority w:val="99"/>
-    <w:rsid w:val="00AC5B39"/>
+    <w:rsid w:val="00125936"/>
     <w:rPr>
+      <w:rFonts w:ascii="Courier New" w:hAnsi="Courier New"/>
+      <w:b/>
+      <w:i w:val="0"/>
       <w:color w:val="4F81BD" w:themeColor="accent1"/>
+      <w:sz w:val="24"/>
+      <w:u w:val="single"/>
     </w:rPr>
   </w:style>
   <w:style w:type="paragraph" w:styleId="ListParagraph">

</xml_diff>

<commit_message>
updated Secure Settings Document secondary document (corrected license and styles)
</commit_message>
<xml_diff>
--- a/source/reference_documents/secondary_documents/implementation phase/Secure Settings Document/Secure Settings Document.docx
+++ b/source/reference_documents/secondary_documents/implementation phase/Secure Settings Document/Secure Settings Document.docx
@@ -28,7 +28,7 @@
         <w:t xml:space="preserve">Version </w:t>
       </w:r>
       <w:r>
-        <w:t>5</w:t>
+        <w:t>6</w:t>
       </w:r>
     </w:p>
     <w:p>
@@ -45,7 +45,7 @@
         <w:rPr>
           <w:noProof/>
         </w:rPr>
-        <w:t>8/5/25 9:36 AM</w:t>
+        <w:t>8/5/25 2:21 PM</w:t>
       </w:r>
       <w:r>
         <w:fldChar w:fldCharType="end"/>
@@ -60,17 +60,11 @@
       </w:r>
     </w:p>
     <w:p>
-      <w:pPr>
-        <w:jc w:val="both"/>
-      </w:pPr>
       <w:r>
         <w:t>Garth Scheidemantel</w:t>
       </w:r>
     </w:p>
     <w:p>
-      <w:pPr>
-        <w:jc w:val="both"/>
-      </w:pPr>
       <w:r>
         <w:t>Charles Wilson</w:t>
       </w:r>
@@ -84,9 +78,6 @@
       </w:r>
     </w:p>
     <w:p>
-      <w:pPr>
-        <w:jc w:val="both"/>
-      </w:pPr>
       <w:r>
         <w:t xml:space="preserve">This document describes the </w:t>
       </w:r>
@@ -112,7 +103,6 @@
     <w:p>
       <w:pPr>
         <w:pStyle w:val="Heading1"/>
-        <w:jc w:val="both"/>
       </w:pPr>
       <w:bookmarkStart w:id="2" w:name="_54bgemmh6zb8" w:colFirst="0" w:colLast="0"/>
       <w:bookmarkEnd w:id="2"/>
@@ -121,9 +111,6 @@
       </w:r>
     </w:p>
     <w:p>
-      <w:pPr>
-        <w:jc w:val="both"/>
-      </w:pPr>
       <w:r>
         <w:t>Security</w:t>
       </w:r>
@@ -137,7 +124,6 @@
     <w:p>
       <w:pPr>
         <w:pStyle w:val="Heading1"/>
-        <w:jc w:val="both"/>
       </w:pPr>
       <w:bookmarkStart w:id="3" w:name="_olcs7d4b90ea" w:colFirst="0" w:colLast="0"/>
       <w:bookmarkEnd w:id="3"/>
@@ -146,9 +132,6 @@
       </w:r>
     </w:p>
     <w:p>
-      <w:pPr>
-        <w:jc w:val="both"/>
-      </w:pPr>
       <w:r>
         <w:t xml:space="preserve">This document is motivated by the need to </w:t>
       </w:r>
@@ -215,7 +198,6 @@
     <w:p>
       <w:pPr>
         <w:pStyle w:val="Heading1"/>
-        <w:jc w:val="both"/>
       </w:pPr>
       <w:bookmarkStart w:id="4" w:name="_f5diy2ktdyyf" w:colFirst="0" w:colLast="0"/>
       <w:bookmarkEnd w:id="4"/>
@@ -225,28 +207,48 @@
     </w:p>
     <w:p>
       <w:pPr>
-        <w:jc w:val="both"/>
-      </w:pPr>
-      <w:r>
-        <w:rPr>
+        <w:tabs>
+          <w:tab w:val="left" w:pos="560"/>
+          <w:tab w:val="left" w:pos="1120"/>
+          <w:tab w:val="left" w:pos="1680"/>
+          <w:tab w:val="left" w:pos="2240"/>
+          <w:tab w:val="left" w:pos="2800"/>
+          <w:tab w:val="left" w:pos="3360"/>
+          <w:tab w:val="left" w:pos="3920"/>
+          <w:tab w:val="left" w:pos="4480"/>
+          <w:tab w:val="left" w:pos="5040"/>
+          <w:tab w:val="left" w:pos="5600"/>
+          <w:tab w:val="left" w:pos="6160"/>
+          <w:tab w:val="left" w:pos="6720"/>
+        </w:tabs>
+        <w:autoSpaceDE w:val="0"/>
+        <w:autoSpaceDN w:val="0"/>
+        <w:adjustRightInd w:val="0"/>
+        <w:spacing w:line="240" w:lineRule="auto"/>
+        <w:rPr>
+          <w:b/>
+          <w:bCs/>
+          <w:color w:val="000000"/>
           <w:lang w:val="en-US"/>
         </w:rPr>
-        <w:t xml:space="preserve">This work </w:t>
-      </w:r>
-      <w:r>
-        <w:rPr>
+      </w:pPr>
+      <w:r>
+        <w:rPr>
+          <w:color w:val="000000"/>
           <w:lang w:val="en-US"/>
         </w:rPr>
-        <w:t xml:space="preserve">was </w:t>
-      </w:r>
-      <w:r>
-        <w:rPr>
+        <w:t xml:space="preserve">This work was </w:t>
+      </w:r>
+      <w:r>
+        <w:rPr>
+          <w:color w:val="000000"/>
           <w:lang w:val="en-US"/>
         </w:rPr>
         <w:t xml:space="preserve">originally </w:t>
       </w:r>
       <w:r>
         <w:rPr>
+          <w:color w:val="000000"/>
           <w:lang w:val="en-US"/>
         </w:rPr>
         <w:t xml:space="preserve">created by </w:t>
@@ -255,64 +257,82 @@
         <w:rPr>
           <w:b/>
           <w:bCs/>
+          <w:color w:val="000000"/>
           <w:lang w:val="en-US"/>
         </w:rPr>
         <w:t>Motional</w:t>
       </w:r>
       <w:r>
         <w:rPr>
+          <w:color w:val="000000"/>
           <w:lang w:val="en-US"/>
         </w:rPr>
-        <w:t xml:space="preserve"> and </w:t>
-      </w:r>
-      <w:r>
-        <w:rPr>
+        <w:t xml:space="preserve"> and is licensed under the </w:t>
+      </w:r>
+      <w:r>
+        <w:rPr>
+          <w:b/>
+          <w:bCs/>
+          <w:color w:val="000000"/>
           <w:lang w:val="en-US"/>
         </w:rPr>
-        <w:t xml:space="preserve">is licensed under the </w:t>
-      </w:r>
-      <w:r>
-        <w:rPr>
-          <w:b/>
-          <w:bCs/>
+        <w:t>Creative Commons</w:t>
+      </w:r>
+      <w:r>
+        <w:rPr>
+          <w:b/>
+          <w:bCs/>
+          <w:color w:val="000000"/>
           <w:lang w:val="en-US"/>
         </w:rPr>
-        <w:t>Creative Commons Attribution-Share Alike (CC4-SA)</w:t>
-      </w:r>
-      <w:r>
-        <w:rPr>
+        <w:t xml:space="preserve"> </w:t>
+      </w:r>
+      <w:r>
+        <w:rPr>
+          <w:b/>
+          <w:bCs/>
+          <w:color w:val="000000"/>
           <w:lang w:val="en-US"/>
         </w:rPr>
-        <w:t xml:space="preserve"> License</w:t>
-      </w:r>
-      <w:r>
-        <w:t>.</w:t>
-      </w:r>
-    </w:p>
-    <w:p>
-      <w:pPr>
-        <w:pStyle w:val="FirstParagraph"/>
-        <w:jc w:val="both"/>
-        <w:rPr>
-          <w:rStyle w:val="Hyperlink"/>
+        <w:t>Attribution-Share Alike (CC BY-SA-4.0)</w:t>
+      </w:r>
+      <w:r>
+        <w:rPr>
+          <w:color w:val="000000"/>
+          <w:lang w:val="en-US"/>
+        </w:rPr>
+        <w:t xml:space="preserve"> License.</w:t>
+      </w:r>
+    </w:p>
+    <w:p>
+      <w:pPr>
+        <w:rPr>
+          <w:sz w:val="40"/>
+          <w:szCs w:val="40"/>
         </w:rPr>
       </w:pPr>
       <w:hyperlink r:id="rId7" w:history="1">
         <w:r>
           <w:rPr>
             <w:rStyle w:val="Hyperlink"/>
+            <w:rFonts w:cs="Courier New"/>
+            <w:bCs/>
+            <w:sz w:val="22"/>
+            <w:lang w:val="en-US"/>
           </w:rPr>
           <w:t>https://creativecommons.org/licenses/by/4.0/legalcode</w:t>
         </w:r>
       </w:hyperlink>
-    </w:p>
-    <w:p>
-      <w:pPr>
-        <w:rPr>
-          <w:sz w:val="40"/>
-          <w:szCs w:val="40"/>
-        </w:rPr>
-      </w:pPr>
+      <w:r>
+        <w:rPr>
+          <w:rFonts w:ascii="Courier New" w:hAnsi="Courier New" w:cs="Courier New"/>
+          <w:b/>
+          <w:bCs/>
+          <w:color w:val="0133EA"/>
+          <w:lang w:val="en-US"/>
+        </w:rPr>
+        <w:t xml:space="preserve"> </w:t>
+      </w:r>
       <w:r>
         <w:br w:type="page"/>
       </w:r>
@@ -327,10 +347,6 @@
       </w:r>
     </w:p>
     <w:p>
-      <w:pPr>
-        <w:spacing w:after="240"/>
-        <w:jc w:val="both"/>
-      </w:pPr>
       <w:r>
         <w:t xml:space="preserve">The most secure application can be compromised because of poorly chosen tool settings. Such configuration errors may be in access control, database management, cryptographic material handling, or communication tools. </w:t>
       </w:r>
@@ -360,10 +376,6 @@
       </w:r>
     </w:p>
     <w:p>
-      <w:pPr>
-        <w:spacing w:after="240"/>
-        <w:jc w:val="both"/>
-      </w:pPr>
       <w:r>
         <w:t>The following diagram illustrates the process to be used:</w:t>
       </w:r>
@@ -485,7 +497,7 @@
                 <w:right w:val="nil"/>
                 <w:between w:val="nil"/>
               </w:pBdr>
-              <w:spacing w:line="240" w:lineRule="auto"/>
+              <w:spacing w:after="0" w:line="240" w:lineRule="auto"/>
               <w:jc w:val="right"/>
               <w:rPr>
                 <w:b/>
@@ -522,7 +534,7 @@
                 <w:right w:val="nil"/>
                 <w:between w:val="nil"/>
               </w:pBdr>
-              <w:spacing w:line="240" w:lineRule="auto"/>
+              <w:spacing w:after="0" w:line="240" w:lineRule="auto"/>
             </w:pPr>
             <w:r>
               <w:t xml:space="preserve">Tool </w:t>
@@ -556,7 +568,7 @@
                 <w:right w:val="nil"/>
                 <w:between w:val="nil"/>
               </w:pBdr>
-              <w:spacing w:line="240" w:lineRule="auto"/>
+              <w:spacing w:after="0" w:line="240" w:lineRule="auto"/>
               <w:jc w:val="right"/>
               <w:rPr>
                 <w:b/>
@@ -593,7 +605,7 @@
                 <w:right w:val="nil"/>
                 <w:between w:val="nil"/>
               </w:pBdr>
-              <w:spacing w:line="240" w:lineRule="auto"/>
+              <w:spacing w:after="0" w:line="240" w:lineRule="auto"/>
             </w:pPr>
             <w:r>
               <w:t>Tool security options</w:t>
@@ -624,7 +636,7 @@
                 <w:right w:val="nil"/>
                 <w:between w:val="nil"/>
               </w:pBdr>
-              <w:spacing w:line="240" w:lineRule="auto"/>
+              <w:spacing w:after="0" w:line="240" w:lineRule="auto"/>
               <w:jc w:val="right"/>
               <w:rPr>
                 <w:b/>
@@ -661,7 +673,7 @@
                 <w:right w:val="nil"/>
                 <w:between w:val="nil"/>
               </w:pBdr>
-              <w:spacing w:line="240" w:lineRule="auto"/>
+              <w:spacing w:after="0" w:line="240" w:lineRule="auto"/>
             </w:pPr>
             <w:r>
               <w:t>Security</w:t>
@@ -727,10 +739,6 @@
     </w:p>
     <w:p/>
     <w:p>
-      <w:pPr>
-        <w:spacing w:after="240"/>
-        <w:jc w:val="both"/>
-      </w:pPr>
       <w:bookmarkStart w:id="6" w:name="_ggw3skhp9e8j" w:colFirst="0" w:colLast="0"/>
       <w:bookmarkStart w:id="7" w:name="_7ztzcq2uoqzj" w:colFirst="0" w:colLast="0"/>
       <w:bookmarkEnd w:id="6"/>
@@ -784,10 +792,6 @@
       </w:r>
     </w:p>
     <w:p>
-      <w:pPr>
-        <w:spacing w:after="240"/>
-        <w:jc w:val="both"/>
-      </w:pPr>
       <w:r>
         <w:t xml:space="preserve">The </w:t>
       </w:r>
@@ -843,6 +847,7 @@
         <w:ind w:left="270" w:hanging="270"/>
       </w:pPr>
       <w:r>
+        <w:lastRenderedPageBreak/>
         <w:t>Description of the option</w:t>
       </w:r>
     </w:p>
@@ -864,7 +869,6 @@
         <w:pStyle w:val="Heading2"/>
       </w:pPr>
       <w:r>
-        <w:lastRenderedPageBreak/>
         <w:t>Categorize Security Options</w:t>
       </w:r>
     </w:p>
@@ -909,7 +913,7 @@
                 <w:right w:val="nil"/>
                 <w:between w:val="nil"/>
               </w:pBdr>
-              <w:spacing w:line="240" w:lineRule="auto"/>
+              <w:spacing w:after="0" w:line="240" w:lineRule="auto"/>
               <w:jc w:val="right"/>
               <w:rPr>
                 <w:b/>
@@ -946,7 +950,7 @@
                 <w:right w:val="nil"/>
                 <w:between w:val="nil"/>
               </w:pBdr>
-              <w:spacing w:line="240" w:lineRule="auto"/>
+              <w:spacing w:after="0" w:line="240" w:lineRule="auto"/>
             </w:pPr>
             <w:r>
               <w:t>Tool security options</w:t>
@@ -977,7 +981,7 @@
                 <w:right w:val="nil"/>
                 <w:between w:val="nil"/>
               </w:pBdr>
-              <w:spacing w:line="240" w:lineRule="auto"/>
+              <w:spacing w:after="0" w:line="240" w:lineRule="auto"/>
               <w:jc w:val="right"/>
               <w:rPr>
                 <w:b/>
@@ -1014,7 +1018,7 @@
                 <w:right w:val="nil"/>
                 <w:between w:val="nil"/>
               </w:pBdr>
-              <w:spacing w:line="240" w:lineRule="auto"/>
+              <w:spacing w:after="0" w:line="240" w:lineRule="auto"/>
             </w:pPr>
             <w:r>
               <w:t>Categorized tool security options</w:t>
@@ -1045,7 +1049,7 @@
                 <w:right w:val="nil"/>
                 <w:between w:val="nil"/>
               </w:pBdr>
-              <w:spacing w:line="240" w:lineRule="auto"/>
+              <w:spacing w:after="0" w:line="240" w:lineRule="auto"/>
               <w:jc w:val="right"/>
               <w:rPr>
                 <w:b/>
@@ -1082,7 +1086,7 @@
                 <w:right w:val="nil"/>
                 <w:between w:val="nil"/>
               </w:pBdr>
-              <w:spacing w:line="240" w:lineRule="auto"/>
+              <w:spacing w:after="0" w:line="240" w:lineRule="auto"/>
             </w:pPr>
             <w:r>
               <w:t>Security</w:t>
@@ -1149,7 +1153,6 @@
     <w:p/>
     <w:p>
       <w:pPr>
-        <w:jc w:val="both"/>
         <w:rPr>
           <w:sz w:val="32"/>
           <w:szCs w:val="32"/>
@@ -1314,7 +1317,7 @@
                 <w:right w:val="nil"/>
                 <w:between w:val="nil"/>
               </w:pBdr>
-              <w:spacing w:line="240" w:lineRule="auto"/>
+              <w:spacing w:after="0" w:line="240" w:lineRule="auto"/>
               <w:jc w:val="right"/>
               <w:rPr>
                 <w:b/>
@@ -1351,7 +1354,7 @@
                 <w:right w:val="nil"/>
                 <w:between w:val="nil"/>
               </w:pBdr>
-              <w:spacing w:line="240" w:lineRule="auto"/>
+              <w:spacing w:after="0" w:line="360" w:lineRule="auto"/>
             </w:pPr>
             <w:r>
               <w:t>Element</w:t>
@@ -1367,7 +1370,7 @@
                 <w:right w:val="nil"/>
                 <w:between w:val="nil"/>
               </w:pBdr>
-              <w:spacing w:line="240" w:lineRule="auto"/>
+              <w:spacing w:after="0" w:line="240" w:lineRule="auto"/>
             </w:pPr>
             <w:r>
               <w:t>Categorized tool security options</w:t>
@@ -1398,7 +1401,7 @@
                 <w:right w:val="nil"/>
                 <w:between w:val="nil"/>
               </w:pBdr>
-              <w:spacing w:line="240" w:lineRule="auto"/>
+              <w:spacing w:after="0" w:line="240" w:lineRule="auto"/>
               <w:jc w:val="right"/>
               <w:rPr>
                 <w:b/>
@@ -1435,7 +1438,7 @@
                 <w:right w:val="nil"/>
                 <w:between w:val="nil"/>
               </w:pBdr>
-              <w:spacing w:line="240" w:lineRule="auto"/>
+              <w:spacing w:after="0" w:line="240" w:lineRule="auto"/>
             </w:pPr>
             <w:r>
               <w:t>Element-specific tool security options</w:t>
@@ -1466,7 +1469,7 @@
                 <w:right w:val="nil"/>
                 <w:between w:val="nil"/>
               </w:pBdr>
-              <w:spacing w:line="240" w:lineRule="auto"/>
+              <w:spacing w:after="0" w:line="240" w:lineRule="auto"/>
               <w:jc w:val="right"/>
               <w:rPr>
                 <w:b/>
@@ -1503,7 +1506,7 @@
                 <w:right w:val="nil"/>
                 <w:between w:val="nil"/>
               </w:pBdr>
-              <w:spacing w:line="240" w:lineRule="auto"/>
+              <w:spacing w:after="0" w:line="360" w:lineRule="auto"/>
             </w:pPr>
             <w:r>
               <w:t>Development SME</w:t>
@@ -1519,7 +1522,7 @@
                 <w:right w:val="nil"/>
                 <w:between w:val="nil"/>
               </w:pBdr>
-              <w:spacing w:line="240" w:lineRule="auto"/>
+              <w:spacing w:after="0" w:line="240" w:lineRule="auto"/>
             </w:pPr>
             <w:r>
               <w:t>Security</w:t>
@@ -1585,10 +1588,6 @@
     </w:p>
     <w:p/>
     <w:p>
-      <w:pPr>
-        <w:spacing w:after="240"/>
-        <w:jc w:val="both"/>
-      </w:pPr>
       <w:r>
         <w:t xml:space="preserve">Using the </w:t>
       </w:r>
@@ -1667,9 +1666,7 @@
     </w:p>
     <w:p>
       <w:pPr>
-        <w:spacing w:after="240"/>
         <w:ind w:left="720" w:hanging="720"/>
-        <w:jc w:val="both"/>
         <w:rPr>
           <w:sz w:val="32"/>
           <w:szCs w:val="32"/>
@@ -1772,7 +1769,7 @@
                 <w:right w:val="nil"/>
                 <w:between w:val="nil"/>
               </w:pBdr>
-              <w:spacing w:line="240" w:lineRule="auto"/>
+              <w:spacing w:after="0" w:line="240" w:lineRule="auto"/>
               <w:jc w:val="right"/>
               <w:rPr>
                 <w:b/>
@@ -1809,7 +1806,7 @@
                 <w:right w:val="nil"/>
                 <w:between w:val="nil"/>
               </w:pBdr>
-              <w:spacing w:line="240" w:lineRule="auto"/>
+              <w:spacing w:after="0" w:line="360" w:lineRule="auto"/>
             </w:pPr>
             <w:r>
               <w:t>Element</w:t>
@@ -1828,7 +1825,7 @@
                 <w:right w:val="nil"/>
                 <w:between w:val="nil"/>
               </w:pBdr>
-              <w:spacing w:line="240" w:lineRule="auto"/>
+              <w:spacing w:after="0" w:line="240" w:lineRule="auto"/>
             </w:pPr>
             <w:r>
               <w:t>Build file</w:t>
@@ -1859,7 +1856,7 @@
                 <w:right w:val="nil"/>
                 <w:between w:val="nil"/>
               </w:pBdr>
-              <w:spacing w:line="240" w:lineRule="auto"/>
+              <w:spacing w:after="0" w:line="240" w:lineRule="auto"/>
               <w:jc w:val="right"/>
               <w:rPr>
                 <w:b/>
@@ -1896,7 +1893,7 @@
                 <w:right w:val="nil"/>
                 <w:between w:val="nil"/>
               </w:pBdr>
-              <w:spacing w:line="240" w:lineRule="auto"/>
+              <w:spacing w:after="0" w:line="240" w:lineRule="auto"/>
             </w:pPr>
             <w:r>
               <w:t>Updated build file</w:t>
@@ -1927,7 +1924,7 @@
                 <w:right w:val="nil"/>
                 <w:between w:val="nil"/>
               </w:pBdr>
-              <w:spacing w:line="240" w:lineRule="auto"/>
+              <w:spacing w:after="0" w:line="240" w:lineRule="auto"/>
               <w:jc w:val="right"/>
               <w:rPr>
                 <w:b/>
@@ -1964,7 +1961,7 @@
                 <w:right w:val="nil"/>
                 <w:between w:val="nil"/>
               </w:pBdr>
-              <w:spacing w:line="240" w:lineRule="auto"/>
+              <w:spacing w:after="0" w:line="240" w:lineRule="auto"/>
             </w:pPr>
             <w:r>
               <w:t>DevOps</w:t>
@@ -2031,8 +2028,6 @@
     <w:p/>
     <w:p>
       <w:pPr>
-        <w:spacing w:after="240"/>
-        <w:jc w:val="both"/>
         <w:rPr>
           <w:sz w:val="32"/>
           <w:szCs w:val="32"/>
@@ -3084,6 +3079,11 @@
   <w:style w:type="paragraph" w:default="1" w:styleId="Normal">
     <w:name w:val="Normal"/>
     <w:qFormat/>
+    <w:rsid w:val="001E0FE6"/>
+    <w:pPr>
+      <w:spacing w:after="240"/>
+      <w:jc w:val="both"/>
+    </w:pPr>
   </w:style>
   <w:style w:type="paragraph" w:styleId="Heading1">
     <w:name w:val="heading 1"/>

</xml_diff>

<commit_message>
Updated Secure Settings Document secondary document (formatting)
</commit_message>
<xml_diff>
--- a/source/reference_documents/secondary_documents/implementation phase/Secure Settings Document/Secure Settings Document.docx
+++ b/source/reference_documents/secondary_documents/implementation phase/Secure Settings Document/Secure Settings Document.docx
@@ -24,11 +24,14 @@
       </w:r>
     </w:p>
     <w:p>
+      <w:pPr>
+        <w:spacing w:after="0"/>
+      </w:pPr>
       <w:r>
         <w:t xml:space="preserve">Version </w:t>
       </w:r>
       <w:r>
-        <w:t>6</w:t>
+        <w:t>7</w:t>
       </w:r>
     </w:p>
     <w:p>
@@ -45,7 +48,7 @@
         <w:rPr>
           <w:noProof/>
         </w:rPr>
-        <w:t>8/5/25 2:21 PM</w:t>
+        <w:t>8/6/25 9:08 AM</w:t>
       </w:r>
       <w:r>
         <w:fldChar w:fldCharType="end"/>
@@ -60,6 +63,9 @@
       </w:r>
     </w:p>
     <w:p>
+      <w:pPr>
+        <w:spacing w:after="0"/>
+      </w:pPr>
       <w:r>
         <w:t>Garth Scheidemantel</w:t>
       </w:r>
@@ -276,25 +282,7 @@
           <w:color w:val="000000"/>
           <w:lang w:val="en-US"/>
         </w:rPr>
-        <w:t>Creative Commons</w:t>
-      </w:r>
-      <w:r>
-        <w:rPr>
-          <w:b/>
-          <w:bCs/>
-          <w:color w:val="000000"/>
-          <w:lang w:val="en-US"/>
-        </w:rPr>
-        <w:t xml:space="preserve"> </w:t>
-      </w:r>
-      <w:r>
-        <w:rPr>
-          <w:b/>
-          <w:bCs/>
-          <w:color w:val="000000"/>
-          <w:lang w:val="en-US"/>
-        </w:rPr>
-        <w:t>Attribution-Share Alike (CC BY-SA-4.0)</w:t>
+        <w:t>Creative Commons Attribution-Share Alike (CC BY-SA-4.0)</w:t>
       </w:r>
       <w:r>
         <w:rPr>
@@ -442,6 +430,7 @@
     <w:p>
       <w:pPr>
         <w:pStyle w:val="Heading1"/>
+        <w:spacing w:after="0" w:line="240" w:lineRule="auto"/>
       </w:pPr>
       <w:r>
         <w:lastRenderedPageBreak/>
@@ -737,7 +726,6 @@
         </w:drawing>
       </w:r>
     </w:p>
-    <w:p/>
     <w:p>
       <w:bookmarkStart w:id="6" w:name="_ggw3skhp9e8j" w:colFirst="0" w:colLast="0"/>
       <w:bookmarkStart w:id="7" w:name="_7ztzcq2uoqzj" w:colFirst="0" w:colLast="0"/>
@@ -847,7 +835,6 @@
         <w:ind w:left="270" w:hanging="270"/>
       </w:pPr>
       <w:r>
-        <w:lastRenderedPageBreak/>
         <w:t>Description of the option</w:t>
       </w:r>
     </w:p>
@@ -869,6 +856,7 @@
         <w:pStyle w:val="Heading2"/>
       </w:pPr>
       <w:r>
+        <w:lastRenderedPageBreak/>
         <w:t>Categorize Security Options</w:t>
       </w:r>
     </w:p>
@@ -1150,7 +1138,6 @@
         </w:drawing>
       </w:r>
     </w:p>
-    <w:p/>
     <w:p>
       <w:pPr>
         <w:rPr>
@@ -1586,7 +1573,6 @@
         </w:drawing>
       </w:r>
     </w:p>
-    <w:p/>
     <w:p>
       <w:r>
         <w:t xml:space="preserve">Using the </w:t>
@@ -2025,7 +2011,6 @@
         </w:drawing>
       </w:r>
     </w:p>
-    <w:p/>
     <w:p>
       <w:pPr>
         <w:rPr>

</xml_diff>

<commit_message>
Updated Secure Settings Document secondary document (additional text for the identification and classification activities)
</commit_message>
<xml_diff>
--- a/source/reference_documents/secondary_documents/implementation phase/Secure Settings Document/Secure Settings Document.docx
+++ b/source/reference_documents/secondary_documents/implementation phase/Secure Settings Document/Secure Settings Document.docx
@@ -31,7 +31,7 @@
         <w:t xml:space="preserve">Version </w:t>
       </w:r>
       <w:r>
-        <w:t>7</w:t>
+        <w:t>8</w:t>
       </w:r>
     </w:p>
     <w:p>
@@ -48,7 +48,7 @@
         <w:rPr>
           <w:noProof/>
         </w:rPr>
-        <w:t>8/6/25 9:08 AM</w:t>
+        <w:t>8/7/25 12:27 PM</w:t>
       </w:r>
       <w:r>
         <w:fldChar w:fldCharType="end"/>
@@ -780,7 +780,17 @@
       </w:r>
     </w:p>
     <w:p>
-      <w:r>
+      <w:pPr>
+        <w:spacing w:after="0"/>
+        <w:jc w:val="left"/>
+      </w:pPr>
+      <w:r>
+        <w:br w:type="page"/>
+      </w:r>
+    </w:p>
+    <w:p>
+      <w:r>
+        <w:lastRenderedPageBreak/>
         <w:t xml:space="preserve">The </w:t>
       </w:r>
       <w:r>
@@ -797,7 +807,13 @@
         <w:t>list</w:t>
       </w:r>
       <w:r>
-        <w:t xml:space="preserve"> of 3-tuples. The values of the </w:t>
+        <w:t xml:space="preserve"> of </w:t>
+      </w:r>
+      <w:r>
+        <w:t>4</w:t>
+      </w:r>
+      <w:r>
+        <w:t xml:space="preserve">-tuples. The values of the </w:t>
       </w:r>
       <w:r>
         <w:t>tuples</w:t>
@@ -849,6 +865,81 @@
       </w:pPr>
       <w:r>
         <w:t>Security relevance</w:t>
+      </w:r>
+    </w:p>
+    <w:p>
+      <w:pPr>
+        <w:pStyle w:val="ListParagraph"/>
+        <w:numPr>
+          <w:ilvl w:val="0"/>
+          <w:numId w:val="2"/>
+        </w:numPr>
+        <w:ind w:left="270" w:hanging="270"/>
+      </w:pPr>
+      <w:r>
+        <w:t>Bug Class</w:t>
+      </w:r>
+    </w:p>
+    <w:p>
+      <w:pPr>
+        <w:spacing w:after="0"/>
+        <w:rPr>
+          <w:sz w:val="32"/>
+          <w:szCs w:val="32"/>
+        </w:rPr>
+      </w:pPr>
+      <w:r>
+        <w:t xml:space="preserve">The set of </w:t>
+      </w:r>
+      <w:r>
+        <w:rPr>
+          <w:b/>
+          <w:bCs/>
+        </w:rPr>
+        <w:t>bug class</w:t>
+      </w:r>
+      <w:r>
+        <w:t xml:space="preserve"> values is taken from the </w:t>
+      </w:r>
+      <w:r>
+        <w:rPr>
+          <w:b/>
+          <w:bCs/>
+          <w:color w:val="000000" w:themeColor="text1"/>
+        </w:rPr>
+        <w:t>NIST SP 800-231 Bugs Framework</w:t>
+      </w:r>
+      <w:r>
+        <w:rPr>
+          <w:b/>
+          <w:bCs/>
+          <w:color w:val="000000" w:themeColor="text1"/>
+        </w:rPr>
+        <w:t xml:space="preserve"> </w:t>
+      </w:r>
+      <w:r>
+        <w:rPr>
+          <w:b/>
+          <w:bCs/>
+          <w:color w:val="0070C0"/>
+          <w:vertAlign w:val="superscript"/>
+        </w:rPr>
+        <w:t>[4]</w:t>
+      </w:r>
+      <w:r>
+        <w:rPr>
+          <w:color w:val="000000" w:themeColor="text1"/>
+        </w:rPr>
+        <w:t xml:space="preserve"> d</w:t>
+      </w:r>
+      <w:r>
+        <w:rPr>
+          <w:color w:val="000000" w:themeColor="text1"/>
+        </w:rPr>
+        <w:t>ocument.</w:t>
+      </w:r>
+      <w:r>
+        <w:br w:type="page"/>
       </w:r>
     </w:p>
     <w:p>
@@ -1165,16 +1256,14 @@
         <w:t xml:space="preserve"> each option a</w:t>
       </w:r>
       <w:r>
-        <w:t xml:space="preserve"> security </w:t>
-      </w:r>
-      <w:r>
-        <w:t>priority</w:t>
-      </w:r>
-      <w:r>
-        <w:t xml:space="preserve"> categor</w:t>
-      </w:r>
-      <w:r>
-        <w:t>y</w:t>
+        <w:t xml:space="preserve"> </w:t>
+      </w:r>
+      <w:r>
+        <w:rPr>
+          <w:b/>
+          <w:bCs/>
+        </w:rPr>
+        <w:t>security priority category</w:t>
       </w:r>
       <w:r>
         <w:t xml:space="preserve">. A </w:t>
@@ -1245,11 +1334,83 @@
     </w:p>
     <w:p>
       <w:pPr>
+        <w:ind w:left="720" w:hanging="720"/>
         <w:rPr>
           <w:sz w:val="32"/>
           <w:szCs w:val="32"/>
         </w:rPr>
       </w:pPr>
+      <w:r>
+        <w:rPr>
+          <w:b/>
+          <w:bCs/>
+          <w:color w:val="0070C0"/>
+        </w:rPr>
+        <w:t>Note:</w:t>
+      </w:r>
+      <w:r>
+        <w:rPr>
+          <w:b/>
+          <w:bCs/>
+          <w:color w:val="0070C0"/>
+        </w:rPr>
+        <w:tab/>
+      </w:r>
+      <w:r>
+        <w:t xml:space="preserve">The </w:t>
+      </w:r>
+      <w:r>
+        <w:rPr>
+          <w:b/>
+          <w:bCs/>
+        </w:rPr>
+        <w:t>security priority category</w:t>
+      </w:r>
+      <w:r>
+        <w:t xml:space="preserve"> </w:t>
+      </w:r>
+      <w:r>
+        <w:t xml:space="preserve">values </w:t>
+      </w:r>
+      <w:r>
+        <w:t xml:space="preserve">should be well-defined such as </w:t>
+      </w:r>
+      <w:r>
+        <w:rPr>
+          <w:b/>
+          <w:bCs/>
+        </w:rPr>
+        <w:t>low</w:t>
+      </w:r>
+      <w:r>
+        <w:t xml:space="preserve">, </w:t>
+      </w:r>
+      <w:r>
+        <w:rPr>
+          <w:b/>
+          <w:bCs/>
+        </w:rPr>
+        <w:t>medium</w:t>
+      </w:r>
+      <w:r>
+        <w:t xml:space="preserve">, and </w:t>
+      </w:r>
+      <w:r>
+        <w:rPr>
+          <w:b/>
+          <w:bCs/>
+        </w:rPr>
+        <w:t>high</w:t>
+      </w:r>
+      <w:r>
+        <w:t>.</w:t>
+      </w:r>
+      <w:r>
+        <w:t xml:space="preserve"> </w:t>
+      </w:r>
+      <w:r>
+        <w:t>The determinants for these should documented in such a way that enables any competent cybersecurity SME to apply them consistently.</w:t>
+      </w:r>
       <w:r>
         <w:br w:type="page"/>
       </w:r>
@@ -2257,11 +2418,56 @@
         <w:t>document)</w:t>
       </w:r>
     </w:p>
+    <w:p>
+      <w:pPr>
+        <w:pStyle w:val="ListParagraph"/>
+        <w:numPr>
+          <w:ilvl w:val="0"/>
+          <w:numId w:val="1"/>
+        </w:numPr>
+        <w:ind w:left="360"/>
+        <w:rPr>
+          <w:color w:val="000000" w:themeColor="text1"/>
+        </w:rPr>
+      </w:pPr>
+      <w:r>
+        <w:rPr>
+          <w:b/>
+          <w:bCs/>
+          <w:color w:val="000000" w:themeColor="text1"/>
+        </w:rPr>
+        <w:t>NIST SP 800-231 Bugs Framework (BF): Formalizing Cybersecurity Weaknesses and Vulnerabilities</w:t>
+      </w:r>
+      <w:r>
+        <w:rPr>
+          <w:color w:val="000000" w:themeColor="text1"/>
+        </w:rPr>
+        <w:br/>
+      </w:r>
+      <w:hyperlink r:id="rId14" w:history="1">
+        <w:r>
+          <w:rPr>
+            <w:rStyle w:val="Hyperlink"/>
+            <w:rFonts w:cs="Courier New"/>
+            <w:szCs w:val="24"/>
+          </w:rPr>
+          <w:t>https://nvlpubs.nist.gov/nistpubs/SpecialPublications/NIST.SP.800-231.pdf</w:t>
+        </w:r>
+      </w:hyperlink>
+      <w:r>
+        <w:rPr>
+          <w:color w:val="000000" w:themeColor="text1"/>
+          <w:sz w:val="24"/>
+          <w:szCs w:val="24"/>
+        </w:rPr>
+        <w:t xml:space="preserve"> </w:t>
+      </w:r>
+    </w:p>
     <w:p/>
     <w:sectPr>
-      <w:footerReference w:type="even" r:id="rId14"/>
-      <w:footerReference w:type="default" r:id="rId15"/>
-      <w:headerReference w:type="first" r:id="rId16"/>
+      <w:footerReference w:type="even" r:id="rId15"/>
+      <w:footerReference w:type="default" r:id="rId16"/>
+      <w:headerReference w:type="first" r:id="rId17"/>
       <w:pgSz w:w="12240" w:h="15840"/>
       <w:pgMar w:top="1440" w:right="1440" w:bottom="1440" w:left="1440" w:header="720" w:footer="720" w:gutter="0"/>
       <w:pgNumType w:start="1"/>
@@ -3186,7 +3392,6 @@
   <w:style w:type="character" w:default="1" w:styleId="DefaultParagraphFont">
     <w:name w:val="Default Paragraph Font"/>
     <w:uiPriority w:val="1"/>
-    <w:semiHidden/>
     <w:unhideWhenUsed/>
   </w:style>
   <w:style w:type="table" w:default="1" w:styleId="TableNormal">

</xml_diff>

<commit_message>
Updated Secure Settings Document secondary document (may do / must do text)
</commit_message>
<xml_diff>
--- a/source/reference_documents/secondary_documents/implementation phase/Secure Settings Document/Secure Settings Document.docx
+++ b/source/reference_documents/secondary_documents/implementation phase/Secure Settings Document/Secure Settings Document.docx
@@ -31,7 +31,7 @@
         <w:t xml:space="preserve">Version </w:t>
       </w:r>
       <w:r>
-        <w:t>8</w:t>
+        <w:t>9</w:t>
       </w:r>
     </w:p>
     <w:p>
@@ -48,7 +48,7 @@
         <w:rPr>
           <w:noProof/>
         </w:rPr>
-        <w:t>8/7/25 12:27 PM</w:t>
+        <w:t>8/8/25 7:54 AM</w:t>
       </w:r>
       <w:r>
         <w:fldChar w:fldCharType="end"/>
@@ -1367,13 +1367,7 @@
         <w:t>security priority category</w:t>
       </w:r>
       <w:r>
-        <w:t xml:space="preserve"> </w:t>
-      </w:r>
-      <w:r>
-        <w:t xml:space="preserve">values </w:t>
-      </w:r>
-      <w:r>
-        <w:t xml:space="preserve">should be well-defined such as </w:t>
+        <w:t xml:space="preserve"> values should be well-defined such as </w:t>
       </w:r>
       <w:r>
         <w:rPr>
@@ -1403,10 +1397,36 @@
         <w:t>high</w:t>
       </w:r>
       <w:r>
-        <w:t>.</w:t>
-      </w:r>
-      <w:r>
-        <w:t xml:space="preserve"> </w:t>
+        <w:t xml:space="preserve">. </w:t>
+      </w:r>
+      <w:r>
+        <w:t xml:space="preserve">A </w:t>
+      </w:r>
+      <w:r>
+        <w:rPr>
+          <w:b/>
+          <w:bCs/>
+        </w:rPr>
+        <w:t>may do</w:t>
+      </w:r>
+      <w:r>
+        <w:t xml:space="preserve"> / </w:t>
+      </w:r>
+      <w:r>
+        <w:rPr>
+          <w:b/>
+          <w:bCs/>
+        </w:rPr>
+        <w:t>must do</w:t>
+      </w:r>
+      <w:r>
+        <w:t xml:space="preserve"> value set may also be used in situations where there is a clear </w:t>
+      </w:r>
+      <w:r>
+        <w:t>distinction</w:t>
+      </w:r>
+      <w:r>
+        <w:t xml:space="preserve">. </w:t>
       </w:r>
       <w:r>
         <w:t>The determinants for these should documented in such a way that enables any competent cybersecurity SME to apply them consistently.</w:t>
@@ -3392,6 +3412,7 @@
   <w:style w:type="character" w:default="1" w:styleId="DefaultParagraphFont">
     <w:name w:val="Default Paragraph Font"/>
     <w:uiPriority w:val="1"/>
+    <w:semiHidden/>
     <w:unhideWhenUsed/>
   </w:style>
   <w:style w:type="table" w:default="1" w:styleId="TableNormal">

</xml_diff>

<commit_message>
added the Secure Settings - Select Options Procedure tertiary document / updated the Secure Settings Document secondary document
</commit_message>
<xml_diff>
--- a/source/reference_documents/secondary_documents/implementation phase/Secure Settings Document/Secure Settings Document.docx
+++ b/source/reference_documents/secondary_documents/implementation phase/Secure Settings Document/Secure Settings Document.docx
@@ -31,7 +31,7 @@
         <w:t xml:space="preserve">Version </w:t>
       </w:r>
       <w:r>
-        <w:t>9</w:t>
+        <w:t>10</w:t>
       </w:r>
     </w:p>
     <w:p>
@@ -48,7 +48,7 @@
         <w:rPr>
           <w:noProof/>
         </w:rPr>
-        <w:t>8/8/25 7:54 AM</w:t>
+        <w:t>9/9/25 8:07 AM</w:t>
       </w:r>
       <w:r>
         <w:fldChar w:fldCharType="end"/>
@@ -382,9 +382,9 @@
           <w:noProof/>
         </w:rPr>
         <w:drawing>
-          <wp:inline distT="0" distB="0" distL="0" distR="0" wp14:anchorId="0D60A2C1" wp14:editId="04836AD1">
-            <wp:extent cx="5943600" cy="1925498"/>
-            <wp:effectExtent l="0" t="0" r="0" b="5080"/>
+          <wp:inline distT="0" distB="0" distL="0" distR="0" wp14:anchorId="0D60A2C1" wp14:editId="5DAD82C9">
+            <wp:extent cx="5943598" cy="1925498"/>
+            <wp:effectExtent l="0" t="0" r="635" b="5080"/>
             <wp:docPr id="1" name="Picture 1"/>
             <wp:cNvGraphicFramePr>
               <a:graphicFrameLocks xmlns:a="http://schemas.openxmlformats.org/drawingml/2006/main" noChangeAspect="1"/>
@@ -411,7 +411,7 @@
                   <pic:spPr>
                     <a:xfrm>
                       <a:off x="0" y="0"/>
-                      <a:ext cx="5943600" cy="1925498"/>
+                      <a:ext cx="5943598" cy="1925498"/>
                     </a:xfrm>
                     <a:prstGeom prst="rect">
                       <a:avLst/>
@@ -467,7 +467,6 @@
         <w:tc>
           <w:tcPr>
             <w:tcW w:w="1520" w:type="dxa"/>
-            <w:shd w:val="clear" w:color="auto" w:fill="auto"/>
             <w:tcMar>
               <w:top w:w="100" w:type="dxa"/>
               <w:left w:w="100" w:type="dxa"/>
@@ -505,7 +504,6 @@
         <w:tc>
           <w:tcPr>
             <w:tcW w:w="2610" w:type="dxa"/>
-            <w:shd w:val="clear" w:color="auto" w:fill="auto"/>
             <w:tcMar>
               <w:top w:w="100" w:type="dxa"/>
               <w:left w:w="100" w:type="dxa"/>
@@ -538,7 +536,6 @@
         <w:tc>
           <w:tcPr>
             <w:tcW w:w="1520" w:type="dxa"/>
-            <w:shd w:val="clear" w:color="auto" w:fill="auto"/>
             <w:tcMar>
               <w:top w:w="100" w:type="dxa"/>
               <w:left w:w="100" w:type="dxa"/>
@@ -576,7 +573,6 @@
         <w:tc>
           <w:tcPr>
             <w:tcW w:w="2610" w:type="dxa"/>
-            <w:shd w:val="clear" w:color="auto" w:fill="auto"/>
             <w:tcMar>
               <w:top w:w="100" w:type="dxa"/>
               <w:left w:w="100" w:type="dxa"/>
@@ -606,7 +602,6 @@
         <w:tc>
           <w:tcPr>
             <w:tcW w:w="1520" w:type="dxa"/>
-            <w:shd w:val="clear" w:color="auto" w:fill="auto"/>
             <w:tcMar>
               <w:top w:w="100" w:type="dxa"/>
               <w:left w:w="100" w:type="dxa"/>
@@ -644,7 +639,6 @@
         <w:tc>
           <w:tcPr>
             <w:tcW w:w="2610" w:type="dxa"/>
-            <w:shd w:val="clear" w:color="auto" w:fill="auto"/>
             <w:tcMar>
               <w:top w:w="100" w:type="dxa"/>
               <w:left w:w="100" w:type="dxa"/>
@@ -973,7 +967,6 @@
         <w:tc>
           <w:tcPr>
             <w:tcW w:w="1520" w:type="dxa"/>
-            <w:shd w:val="clear" w:color="auto" w:fill="auto"/>
             <w:tcMar>
               <w:top w:w="100" w:type="dxa"/>
               <w:left w:w="100" w:type="dxa"/>
@@ -1011,7 +1004,6 @@
         <w:tc>
           <w:tcPr>
             <w:tcW w:w="3510" w:type="dxa"/>
-            <w:shd w:val="clear" w:color="auto" w:fill="auto"/>
             <w:tcMar>
               <w:top w:w="100" w:type="dxa"/>
               <w:left w:w="100" w:type="dxa"/>
@@ -1041,7 +1033,6 @@
         <w:tc>
           <w:tcPr>
             <w:tcW w:w="1520" w:type="dxa"/>
-            <w:shd w:val="clear" w:color="auto" w:fill="auto"/>
             <w:tcMar>
               <w:top w:w="100" w:type="dxa"/>
               <w:left w:w="100" w:type="dxa"/>
@@ -1079,7 +1070,6 @@
         <w:tc>
           <w:tcPr>
             <w:tcW w:w="3510" w:type="dxa"/>
-            <w:shd w:val="clear" w:color="auto" w:fill="auto"/>
             <w:tcMar>
               <w:top w:w="100" w:type="dxa"/>
               <w:left w:w="100" w:type="dxa"/>
@@ -1109,7 +1099,6 @@
         <w:tc>
           <w:tcPr>
             <w:tcW w:w="1520" w:type="dxa"/>
-            <w:shd w:val="clear" w:color="auto" w:fill="auto"/>
             <w:tcMar>
               <w:top w:w="100" w:type="dxa"/>
               <w:left w:w="100" w:type="dxa"/>
@@ -1147,7 +1136,6 @@
         <w:tc>
           <w:tcPr>
             <w:tcW w:w="3510" w:type="dxa"/>
-            <w:shd w:val="clear" w:color="auto" w:fill="auto"/>
             <w:tcMar>
               <w:top w:w="100" w:type="dxa"/>
               <w:left w:w="100" w:type="dxa"/>
@@ -1466,7 +1454,6 @@
         <w:tc>
           <w:tcPr>
             <w:tcW w:w="1520" w:type="dxa"/>
-            <w:shd w:val="clear" w:color="auto" w:fill="auto"/>
             <w:tcMar>
               <w:top w:w="100" w:type="dxa"/>
               <w:left w:w="100" w:type="dxa"/>
@@ -1504,7 +1491,6 @@
         <w:tc>
           <w:tcPr>
             <w:tcW w:w="3960" w:type="dxa"/>
-            <w:shd w:val="clear" w:color="auto" w:fill="auto"/>
             <w:tcMar>
               <w:top w:w="100" w:type="dxa"/>
               <w:left w:w="100" w:type="dxa"/>
@@ -1550,7 +1536,6 @@
         <w:tc>
           <w:tcPr>
             <w:tcW w:w="1520" w:type="dxa"/>
-            <w:shd w:val="clear" w:color="auto" w:fill="auto"/>
             <w:tcMar>
               <w:top w:w="100" w:type="dxa"/>
               <w:left w:w="100" w:type="dxa"/>
@@ -1588,7 +1573,6 @@
         <w:tc>
           <w:tcPr>
             <w:tcW w:w="3960" w:type="dxa"/>
-            <w:shd w:val="clear" w:color="auto" w:fill="auto"/>
             <w:tcMar>
               <w:top w:w="100" w:type="dxa"/>
               <w:left w:w="100" w:type="dxa"/>
@@ -1618,7 +1602,6 @@
         <w:tc>
           <w:tcPr>
             <w:tcW w:w="1520" w:type="dxa"/>
-            <w:shd w:val="clear" w:color="auto" w:fill="auto"/>
             <w:tcMar>
               <w:top w:w="100" w:type="dxa"/>
               <w:left w:w="100" w:type="dxa"/>
@@ -1656,7 +1639,6 @@
         <w:tc>
           <w:tcPr>
             <w:tcW w:w="3960" w:type="dxa"/>
-            <w:shd w:val="clear" w:color="auto" w:fill="auto"/>
             <w:tcMar>
               <w:top w:w="100" w:type="dxa"/>
               <w:left w:w="100" w:type="dxa"/>
@@ -1917,7 +1899,6 @@
         <w:tc>
           <w:tcPr>
             <w:tcW w:w="1520" w:type="dxa"/>
-            <w:shd w:val="clear" w:color="auto" w:fill="auto"/>
             <w:tcMar>
               <w:top w:w="100" w:type="dxa"/>
               <w:left w:w="100" w:type="dxa"/>
@@ -1955,7 +1936,6 @@
         <w:tc>
           <w:tcPr>
             <w:tcW w:w="3960" w:type="dxa"/>
-            <w:shd w:val="clear" w:color="auto" w:fill="auto"/>
             <w:tcMar>
               <w:top w:w="100" w:type="dxa"/>
               <w:left w:w="100" w:type="dxa"/>
@@ -2004,7 +1984,6 @@
         <w:tc>
           <w:tcPr>
             <w:tcW w:w="1520" w:type="dxa"/>
-            <w:shd w:val="clear" w:color="auto" w:fill="auto"/>
             <w:tcMar>
               <w:top w:w="100" w:type="dxa"/>
               <w:left w:w="100" w:type="dxa"/>
@@ -2042,7 +2021,6 @@
         <w:tc>
           <w:tcPr>
             <w:tcW w:w="3960" w:type="dxa"/>
-            <w:shd w:val="clear" w:color="auto" w:fill="auto"/>
             <w:tcMar>
               <w:top w:w="100" w:type="dxa"/>
               <w:left w:w="100" w:type="dxa"/>
@@ -2072,7 +2050,6 @@
         <w:tc>
           <w:tcPr>
             <w:tcW w:w="1520" w:type="dxa"/>
-            <w:shd w:val="clear" w:color="auto" w:fill="auto"/>
             <w:tcMar>
               <w:top w:w="100" w:type="dxa"/>
               <w:left w:w="100" w:type="dxa"/>
@@ -2110,7 +2087,6 @@
         <w:tc>
           <w:tcPr>
             <w:tcW w:w="3960" w:type="dxa"/>
-            <w:shd w:val="clear" w:color="auto" w:fill="auto"/>
             <w:tcMar>
               <w:top w:w="100" w:type="dxa"/>
               <w:left w:w="100" w:type="dxa"/>
@@ -2150,8 +2126,8 @@
           <w:noProof/>
         </w:rPr>
         <w:drawing>
-          <wp:inline distT="0" distB="0" distL="0" distR="0" wp14:anchorId="14C8B1CE" wp14:editId="18A3D3A2">
-            <wp:extent cx="4464154" cy="4420473"/>
+          <wp:inline distT="0" distB="0" distL="0" distR="0" wp14:anchorId="14C8B1CE" wp14:editId="7FCC5A34">
+            <wp:extent cx="4464153" cy="4420473"/>
             <wp:effectExtent l="0" t="0" r="0" b="0"/>
             <wp:docPr id="5" name="Picture 5"/>
             <wp:cNvGraphicFramePr>
@@ -2179,7 +2155,7 @@
                   <pic:spPr>
                     <a:xfrm>
                       <a:off x="0" y="0"/>
-                      <a:ext cx="4464154" cy="4420473"/>
+                      <a:ext cx="4464153" cy="4420473"/>
                     </a:xfrm>
                     <a:prstGeom prst="rect">
                       <a:avLst/>
@@ -2226,7 +2202,7 @@
         <w:t xml:space="preserve">, the </w:t>
       </w:r>
       <w:r>
-        <w:t xml:space="preserve">Dev Ops SME applies the </w:t>
+        <w:t xml:space="preserve">DevOps SME applies the </w:t>
       </w:r>
       <w:r>
         <w:t xml:space="preserve">selected </w:t>
@@ -2253,6 +2229,19 @@
           <w:bCs/>
         </w:rPr>
         <w:t>Updated Build File</w:t>
+      </w:r>
+      <w:r>
+        <w:t xml:space="preserve"> is </w:t>
+      </w:r>
+      <w:r>
+        <w:t xml:space="preserve">created and a </w:t>
+      </w:r>
+      <w:r>
+        <w:rPr>
+          <w:b/>
+          <w:bCs/>
+        </w:rPr>
+        <w:t>Security Options Application Report</w:t>
       </w:r>
       <w:r>
         <w:t xml:space="preserve"> is generated</w:t>

</xml_diff>

<commit_message>
Updated the Secure Settings Document secondary document (consistent motivation section) / cover image
</commit_message>
<xml_diff>
--- a/source/reference_documents/secondary_documents/implementation phase/Secure Settings Document/Secure Settings Document.docx
+++ b/source/reference_documents/secondary_documents/implementation phase/Secure Settings Document/Secure Settings Document.docx
@@ -31,7 +31,10 @@
         <w:t xml:space="preserve">Version </w:t>
       </w:r>
       <w:r>
-        <w:t>10</w:t>
+        <w:t>1</w:t>
+      </w:r>
+      <w:r>
+        <w:t>1</w:t>
       </w:r>
     </w:p>
     <w:p>
@@ -48,7 +51,7 @@
         <w:rPr>
           <w:noProof/>
         </w:rPr>
-        <w:t>9/9/25 8:07 AM</w:t>
+        <w:t>1/20/26 11:39 AM</w:t>
       </w:r>
       <w:r>
         <w:fldChar w:fldCharType="end"/>
@@ -157,45 +160,7 @@
         <w:t>security best practices</w:t>
       </w:r>
       <w:r>
-        <w:t xml:space="preserve">. This is necessary given the nature of safety-critical, cyber-physical systems, subject to certifications such as </w:t>
-      </w:r>
-      <w:r>
-        <w:rPr>
-          <w:b/>
-          <w:bCs/>
-        </w:rPr>
-        <w:t>ISO</w:t>
-      </w:r>
-      <w:r>
-        <w:rPr>
-          <w:b/>
-          <w:bCs/>
-        </w:rPr>
-        <w:t>/SAE</w:t>
-      </w:r>
-      <w:r>
-        <w:rPr>
-          <w:b/>
-          <w:bCs/>
-        </w:rPr>
-        <w:t xml:space="preserve"> 21434</w:t>
-      </w:r>
-      <w:r>
-        <w:t xml:space="preserve"> and </w:t>
-      </w:r>
-      <w:r>
-        <w:rPr>
-          <w:b/>
-          <w:bCs/>
-        </w:rPr>
-        <w:t xml:space="preserve">ISO </w:t>
-      </w:r>
-      <w:r>
-        <w:rPr>
-          <w:b/>
-          <w:bCs/>
-        </w:rPr>
-        <w:t>26262</w:t>
+        <w:t>. This is necessary given the nature of safety-critical, cyber-physical systems</w:t>
       </w:r>
       <w:r>
         <w:t>.</w:t>
@@ -203,10 +168,93 @@
     </w:p>
     <w:p>
       <w:pPr>
-        <w:pStyle w:val="Heading1"/>
+        <w:pStyle w:val="Note"/>
       </w:pPr>
       <w:bookmarkStart w:id="4" w:name="_f5diy2ktdyyf" w:colFirst="0" w:colLast="0"/>
       <w:bookmarkEnd w:id="4"/>
+      <w:r>
+        <w:rPr>
+          <w:b/>
+          <w:bCs/>
+          <w:color w:val="0070C0"/>
+        </w:rPr>
+        <w:t>Note:</w:t>
+      </w:r>
+      <w:r>
+        <w:tab/>
+        <w:t xml:space="preserve">Within the </w:t>
+      </w:r>
+      <w:r>
+        <w:t>context</w:t>
+      </w:r>
+      <w:r>
+        <w:t xml:space="preserve"> of this document, the terms </w:t>
+      </w:r>
+      <w:r>
+        <w:rPr>
+          <w:b/>
+          <w:bCs/>
+          <w:i/>
+          <w:iCs/>
+        </w:rPr>
+        <w:t>security</w:t>
+      </w:r>
+      <w:r>
+        <w:t xml:space="preserve"> and </w:t>
+      </w:r>
+      <w:r>
+        <w:rPr>
+          <w:b/>
+          <w:bCs/>
+          <w:i/>
+          <w:iCs/>
+        </w:rPr>
+        <w:t>cybersecurity</w:t>
+      </w:r>
+      <w:r>
+        <w:t xml:space="preserve"> are used interchangeably. It is presumed that the term </w:t>
+      </w:r>
+      <w:r>
+        <w:rPr>
+          <w:b/>
+          <w:bCs/>
+          <w:i/>
+          <w:iCs/>
+        </w:rPr>
+        <w:t>security</w:t>
+      </w:r>
+      <w:r>
+        <w:t xml:space="preserve"> is being used in reference to </w:t>
+      </w:r>
+      <w:r>
+        <w:rPr>
+          <w:b/>
+          <w:bCs/>
+          <w:i/>
+          <w:iCs/>
+        </w:rPr>
+        <w:t>cybersecurity</w:t>
+      </w:r>
+      <w:r>
+        <w:t xml:space="preserve"> and not </w:t>
+      </w:r>
+      <w:r>
+        <w:rPr>
+          <w:b/>
+          <w:bCs/>
+          <w:i/>
+          <w:iCs/>
+        </w:rPr>
+        <w:t>physical security</w:t>
+      </w:r>
+      <w:r>
+        <w:t>.</w:t>
+      </w:r>
+    </w:p>
+    <w:p>
+      <w:pPr>
+        <w:pStyle w:val="Heading1"/>
+      </w:pPr>
       <w:r>
         <w:t>License</w:t>
       </w:r>
@@ -3583,6 +3631,19 @@
     <w:unhideWhenUsed/>
     <w:rsid w:val="00F50CC5"/>
   </w:style>
+  <w:style w:type="paragraph" w:customStyle="1" w:styleId="Note">
+    <w:name w:val="Note"/>
+    <w:basedOn w:val="Normal"/>
+    <w:qFormat/>
+    <w:rsid w:val="00456A7F"/>
+    <w:pPr>
+      <w:ind w:left="806" w:hanging="806"/>
+    </w:pPr>
+    <w:rPr>
+      <w:rFonts w:eastAsia="Times New Roman"/>
+      <w:lang w:val="en-US"/>
+    </w:rPr>
+  </w:style>
 </w:styles>
 </file>
 

</xml_diff>